<commit_message>
Refresh the July 30 research publication
</commit_message>
<xml_diff>
--- a/public/investor-downloads/daily-brief-2026-07-30.docx
+++ b/public/investor-downloads/daily-brief-2026-07-30.docx
@@ -8,7 +8,7 @@
       </w:pPr>
       <w:r>
         <w:rPr>
-          <w:rFonts w:ascii="Calibri" w:hAnsi="Calibri" w:eastAsia="Heiti TC"/>
+          <w:rFonts w:ascii="Calibri" w:hAnsi="Calibri" w:eastAsia="Arial Unicode MS"/>
           <w:b/>
           <w:i w:val="0"/>
           <w:color w:val="285B9D"/>
@@ -24,7 +24,7 @@
       </w:pPr>
       <w:r>
         <w:rPr>
-          <w:rFonts w:ascii="Calibri" w:hAnsi="Calibri" w:eastAsia="Heiti TC"/>
+          <w:rFonts w:ascii="Calibri" w:hAnsi="Calibri" w:eastAsia="Arial Unicode MS"/>
           <w:b w:val="0"/>
           <w:i w:val="0"/>
         </w:rPr>
@@ -38,7 +38,7 @@
       </w:pPr>
       <w:r>
         <w:rPr>
-          <w:rFonts w:ascii="Calibri" w:hAnsi="Calibri" w:eastAsia="Heiti TC"/>
+          <w:rFonts w:ascii="Calibri" w:hAnsi="Calibri" w:eastAsia="Arial Unicode MS"/>
           <w:b w:val="0"/>
           <w:i w:val="0"/>
         </w:rPr>
@@ -51,7 +51,7 @@
       </w:pPr>
       <w:r>
         <w:rPr>
-          <w:rFonts w:ascii="Calibri" w:hAnsi="Calibri" w:eastAsia="Heiti TC"/>
+          <w:rFonts w:ascii="Calibri" w:hAnsi="Calibri" w:eastAsia="Arial Unicode MS"/>
           <w:b/>
           <w:i w:val="0"/>
           <w:color w:val="0B2545"/>
@@ -66,13 +66,13 @@
       </w:pPr>
       <w:r>
         <w:rPr>
-          <w:rFonts w:ascii="Calibri" w:hAnsi="Calibri" w:eastAsia="Heiti TC"/>
+          <w:rFonts w:ascii="Calibri" w:hAnsi="Calibri" w:eastAsia="Arial Unicode MS"/>
           <w:b w:val="0"/>
           <w:i w:val="0"/>
           <w:color w:val="334155"/>
           <w:sz w:val="22"/>
         </w:rPr>
-        <w:t>2026-07-30 共纳入 66 篇中文研究结果，覆盖 0 位活跃分析师和 5 条主要行业链，较 2026-07-29 的主题变化可在右侧动量表中核对。简报优先呈现可被报告链接追溯的结论，而不是孤立摘要。</w:t>
+        <w:t>2026-07-30 共纳入 185 篇中文研究结果，覆盖 0 位活跃分析师和 6 条主要行业链，较 2026-07-29 的主题变化可在右侧动量表中核对。简报优先呈现可被报告链接追溯的结论，而不是孤立摘要。</w:t>
       </w:r>
     </w:p>
     <w:tbl>
@@ -101,7 +101,7 @@
             </w:pPr>
             <w:r>
               <w:rPr>
-                <w:rFonts w:ascii="Calibri" w:hAnsi="Calibri" w:eastAsia="Heiti TC"/>
+                <w:rFonts w:ascii="Calibri" w:hAnsi="Calibri" w:eastAsia="Arial Unicode MS"/>
                 <w:b/>
                 <w:color w:val="667085"/>
                 <w:sz w:val="17"/>
@@ -111,12 +111,12 @@
             </w:r>
             <w:r>
               <w:rPr>
-                <w:rFonts w:ascii="Calibri" w:hAnsi="Calibri" w:eastAsia="Heiti TC"/>
+                <w:rFonts w:ascii="Calibri" w:hAnsi="Calibri" w:eastAsia="Arial Unicode MS"/>
                 <w:b/>
                 <w:color w:val="285B9D"/>
                 <w:sz w:val="36"/>
               </w:rPr>
-              <w:t>66</w:t>
+              <w:t>185</w:t>
             </w:r>
           </w:p>
         </w:tc>
@@ -132,7 +132,7 @@
             </w:pPr>
             <w:r>
               <w:rPr>
-                <w:rFonts w:ascii="Calibri" w:hAnsi="Calibri" w:eastAsia="Heiti TC"/>
+                <w:rFonts w:ascii="Calibri" w:hAnsi="Calibri" w:eastAsia="Arial Unicode MS"/>
                 <w:b/>
                 <w:color w:val="667085"/>
                 <w:sz w:val="17"/>
@@ -142,7 +142,7 @@
             </w:r>
             <w:r>
               <w:rPr>
-                <w:rFonts w:ascii="Calibri" w:hAnsi="Calibri" w:eastAsia="Heiti TC"/>
+                <w:rFonts w:ascii="Calibri" w:hAnsi="Calibri" w:eastAsia="Arial Unicode MS"/>
                 <w:b/>
                 <w:color w:val="237A5B"/>
                 <w:sz w:val="36"/>
@@ -163,7 +163,7 @@
             </w:pPr>
             <w:r>
               <w:rPr>
-                <w:rFonts w:ascii="Calibri" w:hAnsi="Calibri" w:eastAsia="Heiti TC"/>
+                <w:rFonts w:ascii="Calibri" w:hAnsi="Calibri" w:eastAsia="Arial Unicode MS"/>
                 <w:b/>
                 <w:color w:val="667085"/>
                 <w:sz w:val="17"/>
@@ -173,12 +173,12 @@
             </w:r>
             <w:r>
               <w:rPr>
-                <w:rFonts w:ascii="Calibri" w:hAnsi="Calibri" w:eastAsia="Heiti TC"/>
+                <w:rFonts w:ascii="Calibri" w:hAnsi="Calibri" w:eastAsia="Arial Unicode MS"/>
                 <w:b/>
                 <w:color w:val="A8731B"/>
                 <w:sz w:val="36"/>
               </w:rPr>
-              <w:t>5</w:t>
+              <w:t>6</w:t>
             </w:r>
           </w:p>
         </w:tc>
@@ -194,7 +194,7 @@
             </w:pPr>
             <w:r>
               <w:rPr>
-                <w:rFonts w:ascii="Calibri" w:hAnsi="Calibri" w:eastAsia="Heiti TC"/>
+                <w:rFonts w:ascii="Calibri" w:hAnsi="Calibri" w:eastAsia="Arial Unicode MS"/>
                 <w:b/>
                 <w:color w:val="667085"/>
                 <w:sz w:val="17"/>
@@ -204,7 +204,7 @@
             </w:r>
             <w:r>
               <w:rPr>
-                <w:rFonts w:ascii="Calibri" w:hAnsi="Calibri" w:eastAsia="Heiti TC"/>
+                <w:rFonts w:ascii="Calibri" w:hAnsi="Calibri" w:eastAsia="Arial Unicode MS"/>
                 <w:b/>
                 <w:color w:val="B43D49"/>
                 <w:sz w:val="36"/>
@@ -268,7 +268,7 @@
       </w:pPr>
       <w:r>
         <w:rPr>
-          <w:rFonts w:ascii="Calibri" w:hAnsi="Calibri" w:eastAsia="Heiti TC"/>
+          <w:rFonts w:ascii="Calibri" w:hAnsi="Calibri" w:eastAsia="Arial Unicode MS"/>
           <w:b w:val="0"/>
           <w:i/>
           <w:color w:val="667085"/>
@@ -292,7 +292,7 @@
       </w:pPr>
       <w:r>
         <w:rPr>
-          <w:rFonts w:ascii="Calibri" w:hAnsi="Calibri" w:eastAsia="Heiti TC"/>
+          <w:rFonts w:ascii="Calibri" w:hAnsi="Calibri" w:eastAsia="Arial Unicode MS"/>
           <w:b/>
           <w:color w:val="285B9D"/>
           <w:sz w:val="21"/>
@@ -304,7 +304,7 @@
           <w:rPr>
             <w:color w:val="285B9D"/>
             <w:u w:val="single"/>
-            <w:rFonts w:eastAsia="Heiti TC" w:ascii="Calibri" w:hAnsi="Calibri"/>
+            <w:rFonts w:eastAsia="Arial Unicode MS" w:ascii="Calibri" w:hAnsi="Calibri"/>
           </w:rPr>
           <w:t>2026-07-30 — 解除电力节流的现实节奏 是今日最高权重结论，核心证据来自 未识别，关联 AI 基础设施。</w:t>
         </w:r>
@@ -317,7 +317,7 @@
       </w:pPr>
       <w:r>
         <w:rPr>
-          <w:rFonts w:ascii="Calibri" w:hAnsi="Calibri" w:eastAsia="Heiti TC"/>
+          <w:rFonts w:ascii="Calibri" w:hAnsi="Calibri" w:eastAsia="Arial Unicode MS"/>
           <w:b/>
           <w:color w:val="285B9D"/>
           <w:sz w:val="21"/>
@@ -326,11 +326,11 @@
       </w:r>
       <w:r>
         <w:rPr>
-          <w:rFonts w:ascii="Calibri" w:hAnsi="Calibri" w:eastAsia="Heiti TC"/>
+          <w:rFonts w:ascii="Calibri" w:hAnsi="Calibri" w:eastAsia="Arial Unicode MS"/>
           <w:color w:val="111827"/>
           <w:sz w:val="21"/>
         </w:rPr>
-        <w:t>通胀 今日 降温，当日计数 62，前一日计数 342。</w:t>
+        <w:t>通胀 今日 降温，当日计数 176，前一日计数 347。</w:t>
       </w:r>
     </w:p>
     <w:p>
@@ -340,7 +340,7 @@
       </w:pPr>
       <w:r>
         <w:rPr>
-          <w:rFonts w:ascii="Calibri" w:hAnsi="Calibri" w:eastAsia="Heiti TC"/>
+          <w:rFonts w:ascii="Calibri" w:hAnsi="Calibri" w:eastAsia="Arial Unicode MS"/>
           <w:b/>
           <w:color w:val="285B9D"/>
           <w:sz w:val="21"/>
@@ -352,7 +352,7 @@
           <w:rPr>
             <w:color w:val="285B9D"/>
             <w:u w:val="single"/>
-            <w:rFonts w:eastAsia="Heiti TC" w:ascii="Calibri" w:hAnsi="Calibri"/>
+            <w:rFonts w:eastAsia="Arial Unicode MS" w:ascii="Calibri" w:hAnsi="Calibri"/>
           </w:rPr>
           <w:t>风险矩阵最需要跟踪的是 AI 基础设施：数据中心电力、电网和部署瓶颈对TSMC需求兑现的约束。</w:t>
         </w:r>
@@ -365,7 +365,7 @@
       </w:pPr>
       <w:r>
         <w:rPr>
-          <w:rFonts w:ascii="Calibri" w:hAnsi="Calibri" w:eastAsia="Heiti TC"/>
+          <w:rFonts w:ascii="Calibri" w:hAnsi="Calibri" w:eastAsia="Arial Unicode MS"/>
           <w:b/>
           <w:color w:val="285B9D"/>
           <w:sz w:val="21"/>
@@ -377,9 +377,9 @@
           <w:rPr>
             <w:color w:val="285B9D"/>
             <w:u w:val="single"/>
-            <w:rFonts w:eastAsia="Heiti TC" w:ascii="Calibri" w:hAnsi="Calibri"/>
+            <w:rFonts w:eastAsia="Arial Unicode MS" w:ascii="Calibri" w:hAnsi="Calibri"/>
           </w:rPr>
-          <w:t>宏观通胀传导 今日 64 条、近七日 2104 条，风险信号 1321 条。</w:t>
+          <w:t>宏观通胀传导 今日 178 条、近七日 2230 条，风险信号 1375 条。</w:t>
         </w:r>
       </w:hyperlink>
     </w:p>
@@ -403,7 +403,7 @@
           <w:p>
             <w:r>
               <w:rPr>
-                <w:rFonts w:ascii="Calibri" w:hAnsi="Calibri" w:eastAsia="Heiti TC"/>
+                <w:rFonts w:ascii="Calibri" w:hAnsi="Calibri" w:eastAsia="Arial Unicode MS"/>
                 <w:b/>
                 <w:color w:val="7A5A00"/>
                 <w:sz w:val="21"/>
@@ -412,7 +412,7 @@
             </w:r>
             <w:r>
               <w:rPr>
-                <w:rFonts w:ascii="Calibri" w:hAnsi="Calibri" w:eastAsia="Heiti TC"/>
+                <w:rFonts w:ascii="Calibri" w:hAnsi="Calibri" w:eastAsia="Arial Unicode MS"/>
                 <w:color w:val="7C2D12"/>
                 <w:sz w:val="21"/>
               </w:rPr>
@@ -483,7 +483,7 @@
       </w:pPr>
       <w:r>
         <w:rPr>
-          <w:rFonts w:ascii="Calibri" w:hAnsi="Calibri" w:eastAsia="Heiti TC"/>
+          <w:rFonts w:ascii="Calibri" w:hAnsi="Calibri" w:eastAsia="Arial Unicode MS"/>
           <w:b w:val="0"/>
           <w:i/>
           <w:color w:val="667085"/>
@@ -540,7 +540,7 @@
       </w:pPr>
       <w:r>
         <w:rPr>
-          <w:rFonts w:ascii="Calibri" w:hAnsi="Calibri" w:eastAsia="Heiti TC"/>
+          <w:rFonts w:ascii="Calibri" w:hAnsi="Calibri" w:eastAsia="Arial Unicode MS"/>
           <w:b w:val="0"/>
           <w:i/>
           <w:color w:val="667085"/>
@@ -602,7 +602,7 @@
       </w:pPr>
       <w:r>
         <w:rPr>
-          <w:rFonts w:ascii="Calibri" w:hAnsi="Calibri" w:eastAsia="Heiti TC"/>
+          <w:rFonts w:ascii="Calibri" w:hAnsi="Calibri" w:eastAsia="Arial Unicode MS"/>
           <w:b w:val="0"/>
           <w:i/>
           <w:color w:val="667085"/>
@@ -664,7 +664,7 @@
       </w:pPr>
       <w:r>
         <w:rPr>
-          <w:rFonts w:ascii="Calibri" w:hAnsi="Calibri" w:eastAsia="Heiti TC"/>
+          <w:rFonts w:ascii="Calibri" w:hAnsi="Calibri" w:eastAsia="Arial Unicode MS"/>
           <w:b w:val="0"/>
           <w:i/>
           <w:color w:val="667085"/>
@@ -687,7 +687,7 @@
       </w:pPr>
       <w:r>
         <w:rPr>
-          <w:rFonts w:ascii="Calibri" w:hAnsi="Calibri" w:eastAsia="Heiti TC"/>
+          <w:rFonts w:ascii="Calibri" w:hAnsi="Calibri" w:eastAsia="Arial Unicode MS"/>
           <w:b/>
           <w:i w:val="0"/>
           <w:color w:val="0B2545"/>
@@ -702,7 +702,7 @@
       </w:pPr>
       <w:r>
         <w:rPr>
-          <w:rFonts w:ascii="Calibri" w:hAnsi="Calibri" w:eastAsia="Heiti TC"/>
+          <w:rFonts w:ascii="Calibri" w:hAnsi="Calibri" w:eastAsia="Arial Unicode MS"/>
           <w:b w:val="0"/>
           <w:i w:val="0"/>
           <w:color w:val="667085"/>
@@ -717,7 +717,7 @@
       </w:pPr>
       <w:r>
         <w:rPr>
-          <w:rFonts w:ascii="Calibri" w:hAnsi="Calibri" w:eastAsia="Heiti TC"/>
+          <w:rFonts w:ascii="Calibri" w:hAnsi="Calibri" w:eastAsia="Arial Unicode MS"/>
           <w:b w:val="0"/>
           <w:i w:val="0"/>
           <w:color w:val="334155"/>
@@ -732,7 +732,7 @@
       </w:pPr>
       <w:r>
         <w:rPr>
-          <w:rFonts w:ascii="Calibri" w:hAnsi="Calibri" w:eastAsia="Heiti TC"/>
+          <w:rFonts w:ascii="Calibri" w:hAnsi="Calibri" w:eastAsia="Arial Unicode MS"/>
           <w:b w:val="0"/>
           <w:i w:val="0"/>
           <w:color w:val="667085"/>
@@ -745,7 +745,7 @@
           <w:rPr>
             <w:color w:val="285B9D"/>
             <w:u w:val="single"/>
-            <w:rFonts w:eastAsia="Heiti TC" w:ascii="Calibri" w:hAnsi="Calibri"/>
+            <w:rFonts w:eastAsia="Arial Unicode MS" w:ascii="Calibri" w:hAnsi="Calibri"/>
           </w:rPr>
           <w:t>reports/archive-0e65fe1c87bb</w:t>
         </w:r>
@@ -757,13 +757,13 @@
       </w:pPr>
       <w:r>
         <w:rPr>
-          <w:rFonts w:ascii="Calibri" w:hAnsi="Calibri" w:eastAsia="Heiti TC"/>
+          <w:rFonts w:ascii="Calibri" w:hAnsi="Calibri" w:eastAsia="Arial Unicode MS"/>
           <w:b/>
           <w:i w:val="0"/>
           <w:color w:val="0B2545"/>
           <w:sz w:val="23"/>
         </w:rPr>
-        <w:t>2. 2026-07-30 美股AI电力设备仓位压力测试</w:t>
+        <w:t>2. 压力测试：五步现金释放瀑布下能源杠铃的执行压力与流动性约束</w:t>
       </w:r>
     </w:p>
     <w:p>
@@ -772,7 +772,147 @@
       </w:pPr>
       <w:r>
         <w:rPr>
-          <w:rFonts w:ascii="Calibri" w:hAnsi="Calibri" w:eastAsia="Heiti TC"/>
+          <w:rFonts w:ascii="Calibri" w:hAnsi="Calibri" w:eastAsia="Arial Unicode MS"/>
+          <w:b w:val="0"/>
+          <w:i w:val="0"/>
+          <w:color w:val="667085"/>
+          <w:sz w:val="17"/>
+        </w:rPr>
+        <w:t>未识别 · 宏观通胀传导 · score 45.4</w:t>
+      </w:r>
+    </w:p>
+    <w:p>
+      <w:pPr>
+        <w:spacing w:before="0" w:after="100" w:line="264" w:lineRule="auto"/>
+      </w:pPr>
+      <w:r>
+        <w:rPr>
+          <w:rFonts w:ascii="Calibri" w:hAnsi="Calibri" w:eastAsia="Arial Unicode MS"/>
+          <w:b w:val="0"/>
+          <w:i w:val="0"/>
+          <w:color w:val="334155"/>
+          <w:sz w:val="20"/>
+        </w:rPr>
+        <w:t>研究 Board 6686cc8b-c32d-49b5-b1db-44363039c885 · 研究记录 分析师 energy-analyst（能源行业分析师）· 工作日 2026-07-30（Asia/Singapore）[S0] · 立场 stress-test（压力测试） 工作区...</w:t>
+      </w:r>
+    </w:p>
+    <w:p>
+      <w:pPr>
+        <w:spacing w:before="0" w:after="160" w:line="264" w:lineRule="auto"/>
+      </w:pPr>
+      <w:r>
+        <w:rPr>
+          <w:rFonts w:ascii="Calibri" w:hAnsi="Calibri" w:eastAsia="Arial Unicode MS"/>
+          <w:b w:val="0"/>
+          <w:i w:val="0"/>
+          <w:color w:val="667085"/>
+          <w:sz w:val="17"/>
+        </w:rPr>
+        <w:t xml:space="preserve">Report: </w:t>
+      </w:r>
+      <w:hyperlink r:id="rId19">
+        <w:r>
+          <w:rPr>
+            <w:color w:val="285B9D"/>
+            <w:u w:val="single"/>
+            <w:rFonts w:eastAsia="Arial Unicode MS" w:ascii="Calibri" w:hAnsi="Calibri"/>
+          </w:rPr>
+          <w:t>reports/archive-feecdb4d7ba1</w:t>
+        </w:r>
+      </w:hyperlink>
+    </w:p>
+    <w:p>
+      <w:pPr>
+        <w:spacing w:before="0" w:after="40" w:line="264" w:lineRule="auto"/>
+      </w:pPr>
+      <w:r>
+        <w:rPr>
+          <w:rFonts w:ascii="Calibri" w:hAnsi="Calibri" w:eastAsia="Arial Unicode MS"/>
+          <w:b/>
+          <w:i w:val="0"/>
+          <w:color w:val="0B2545"/>
+          <w:sz w:val="23"/>
+        </w:rPr>
+        <w:t>3. 霍尔木兹石油溢价:可持续性与情景油价路径</w:t>
+      </w:r>
+    </w:p>
+    <w:p>
+      <w:pPr>
+        <w:spacing w:before="0" w:after="40" w:line="264" w:lineRule="auto"/>
+      </w:pPr>
+      <w:r>
+        <w:rPr>
+          <w:rFonts w:ascii="Calibri" w:hAnsi="Calibri" w:eastAsia="Arial Unicode MS"/>
+          <w:b w:val="0"/>
+          <w:i w:val="0"/>
+          <w:color w:val="667085"/>
+          <w:sz w:val="17"/>
+        </w:rPr>
+        <w:t>未识别 · 宏观通胀传导 · score 45.3</w:t>
+      </w:r>
+    </w:p>
+    <w:p>
+      <w:pPr>
+        <w:spacing w:before="0" w:after="100" w:line="264" w:lineRule="auto"/>
+      </w:pPr>
+      <w:r>
+        <w:rPr>
+          <w:rFonts w:ascii="Calibri" w:hAnsi="Calibri" w:eastAsia="Arial Unicode MS"/>
+          <w:b w:val="0"/>
+          <w:i w:val="0"/>
+          <w:color w:val="334155"/>
+          <w:sz w:val="20"/>
+        </w:rPr>
+        <w:t>研究记录 · 分析师: 能源行业分析师( energy-analyst ) 工作日期: 2026-07-30(Asia/Singapore) · 立场: 压力测试(stress-test) 根主题: 失去前瞻指引缓冲垫的 Warsh 美联储遭遇霍尔木兹石油冲...</w:t>
+      </w:r>
+    </w:p>
+    <w:p>
+      <w:pPr>
+        <w:spacing w:before="0" w:after="160" w:line="264" w:lineRule="auto"/>
+      </w:pPr>
+      <w:r>
+        <w:rPr>
+          <w:rFonts w:ascii="Calibri" w:hAnsi="Calibri" w:eastAsia="Arial Unicode MS"/>
+          <w:b w:val="0"/>
+          <w:i w:val="0"/>
+          <w:color w:val="667085"/>
+          <w:sz w:val="17"/>
+        </w:rPr>
+        <w:t xml:space="preserve">Report: </w:t>
+      </w:r>
+      <w:hyperlink r:id="rId20">
+        <w:r>
+          <w:rPr>
+            <w:color w:val="285B9D"/>
+            <w:u w:val="single"/>
+            <w:rFonts w:eastAsia="Arial Unicode MS" w:ascii="Calibri" w:hAnsi="Calibri"/>
+          </w:rPr>
+          <w:t>reports/archive-389911d91c38</w:t>
+        </w:r>
+      </w:hyperlink>
+    </w:p>
+    <w:p>
+      <w:pPr>
+        <w:spacing w:before="0" w:after="40" w:line="264" w:lineRule="auto"/>
+      </w:pPr>
+      <w:r>
+        <w:rPr>
+          <w:rFonts w:ascii="Calibri" w:hAnsi="Calibri" w:eastAsia="Arial Unicode MS"/>
+          <w:b/>
+          <w:i w:val="0"/>
+          <w:color w:val="0B2545"/>
+          <w:sz w:val="23"/>
+        </w:rPr>
+        <w:t>4. 2026-07-30 美股AI电力设备仓位压力测试</w:t>
+      </w:r>
+    </w:p>
+    <w:p>
+      <w:pPr>
+        <w:spacing w:before="0" w:after="40" w:line="264" w:lineRule="auto"/>
+      </w:pPr>
+      <w:r>
+        <w:rPr>
+          <w:rFonts w:ascii="Calibri" w:hAnsi="Calibri" w:eastAsia="Arial Unicode MS"/>
           <w:b w:val="0"/>
           <w:i w:val="0"/>
           <w:color w:val="667085"/>
@@ -787,7 +927,7 @@
       </w:pPr>
       <w:r>
         <w:rPr>
-          <w:rFonts w:ascii="Calibri" w:hAnsi="Calibri" w:eastAsia="Heiti TC"/>
+          <w:rFonts w:ascii="Calibri" w:hAnsi="Calibri" w:eastAsia="Arial Unicode MS"/>
           <w:b w:val="0"/>
           <w:i w:val="0"/>
           <w:color w:val="334155"/>
@@ -802,147 +942,7 @@
       </w:pPr>
       <w:r>
         <w:rPr>
-          <w:rFonts w:ascii="Calibri" w:hAnsi="Calibri" w:eastAsia="Heiti TC"/>
-          <w:b w:val="0"/>
-          <w:i w:val="0"/>
-          <w:color w:val="667085"/>
-          <w:sz w:val="17"/>
-        </w:rPr>
-        <w:t xml:space="preserve">Report: </w:t>
-      </w:r>
-      <w:hyperlink r:id="rId19">
-        <w:r>
-          <w:rPr>
-            <w:color w:val="285B9D"/>
-            <w:u w:val="single"/>
-            <w:rFonts w:eastAsia="Heiti TC" w:ascii="Calibri" w:hAnsi="Calibri"/>
-          </w:rPr>
-          <w:t>reports/archive-72b276b899e5</w:t>
-        </w:r>
-      </w:hyperlink>
-    </w:p>
-    <w:p>
-      <w:pPr>
-        <w:spacing w:before="0" w:after="40" w:line="264" w:lineRule="auto"/>
-      </w:pPr>
-      <w:r>
-        <w:rPr>
-          <w:rFonts w:ascii="Calibri" w:hAnsi="Calibri" w:eastAsia="Heiti TC"/>
-          <w:b/>
-          <w:i w:val="0"/>
-          <w:color w:val="0B2545"/>
-          <w:sz w:val="23"/>
-        </w:rPr>
-        <w:t>3. 2026-07-30 — A 股市场结构下的 HBM 与 AI 电力链交易表达</w:t>
-      </w:r>
-    </w:p>
-    <w:p>
-      <w:pPr>
-        <w:spacing w:before="0" w:after="40" w:line="264" w:lineRule="auto"/>
-      </w:pPr>
-      <w:r>
-        <w:rPr>
-          <w:rFonts w:ascii="Calibri" w:hAnsi="Calibri" w:eastAsia="Heiti TC"/>
-          <w:b w:val="0"/>
-          <w:i w:val="0"/>
-          <w:color w:val="667085"/>
-          <w:sz w:val="17"/>
-        </w:rPr>
-        <w:t>未识别 · AI 基础设施 · score 42.8</w:t>
-      </w:r>
-    </w:p>
-    <w:p>
-      <w:pPr>
-        <w:spacing w:before="0" w:after="100" w:line="264" w:lineRule="auto"/>
-      </w:pPr>
-      <w:r>
-        <w:rPr>
-          <w:rFonts w:ascii="Calibri" w:hAnsi="Calibri" w:eastAsia="Heiti TC"/>
-          <w:b w:val="0"/>
-          <w:i w:val="0"/>
-          <w:color w:val="334155"/>
-          <w:sz w:val="20"/>
-        </w:rPr>
-        <w:t>2026-07-30 — A 股市场结构下的 HBM 与 AI 电力链交易表达</w:t>
-      </w:r>
-    </w:p>
-    <w:p>
-      <w:pPr>
-        <w:spacing w:before="0" w:after="160" w:line="264" w:lineRule="auto"/>
-      </w:pPr>
-      <w:r>
-        <w:rPr>
-          <w:rFonts w:ascii="Calibri" w:hAnsi="Calibri" w:eastAsia="Heiti TC"/>
-          <w:b w:val="0"/>
-          <w:i w:val="0"/>
-          <w:color w:val="667085"/>
-          <w:sz w:val="17"/>
-        </w:rPr>
-        <w:t xml:space="preserve">Report: </w:t>
-      </w:r>
-      <w:hyperlink r:id="rId20">
-        <w:r>
-          <w:rPr>
-            <w:color w:val="285B9D"/>
-            <w:u w:val="single"/>
-            <w:rFonts w:eastAsia="Heiti TC" w:ascii="Calibri" w:hAnsi="Calibri"/>
-          </w:rPr>
-          <w:t>reports/archive-9e10df86d89a</w:t>
-        </w:r>
-      </w:hyperlink>
-    </w:p>
-    <w:p>
-      <w:pPr>
-        <w:spacing w:before="0" w:after="40" w:line="264" w:lineRule="auto"/>
-      </w:pPr>
-      <w:r>
-        <w:rPr>
-          <w:rFonts w:ascii="Calibri" w:hAnsi="Calibri" w:eastAsia="Heiti TC"/>
-          <w:b/>
-          <w:i w:val="0"/>
-          <w:color w:val="0B2545"/>
-          <w:sz w:val="23"/>
-        </w:rPr>
-        <w:t>4. research discussion Session Brief</w:t>
-      </w:r>
-    </w:p>
-    <w:p>
-      <w:pPr>
-        <w:spacing w:before="0" w:after="40" w:line="264" w:lineRule="auto"/>
-      </w:pPr>
-      <w:r>
-        <w:rPr>
-          <w:rFonts w:ascii="Calibri" w:hAnsi="Calibri" w:eastAsia="Heiti TC"/>
-          <w:b w:val="0"/>
-          <w:i w:val="0"/>
-          <w:color w:val="667085"/>
-          <w:sz w:val="17"/>
-        </w:rPr>
-        <w:t>未识别 · 宏观通胀传导 · score 42.1</w:t>
-      </w:r>
-    </w:p>
-    <w:p>
-      <w:pPr>
-        <w:spacing w:before="0" w:after="100" w:line="264" w:lineRule="auto"/>
-      </w:pPr>
-      <w:r>
-        <w:rPr>
-          <w:rFonts w:ascii="Calibri" w:hAnsi="Calibri" w:eastAsia="Heiti TC"/>
-          <w:b w:val="0"/>
-          <w:i w:val="0"/>
-          <w:color w:val="334155"/>
-          <w:sz w:val="20"/>
-        </w:rPr>
-        <w:t>Board ID: 35cd6124-1630-47e3-a761-a575c5349265 - Shared Agent Route session: 575ea309-1a63-46cf-ad01-f59065594984 - Root topic: 2026-07-30美国7月FOMC按兵不动后的全球利率与美元风险...</w:t>
-      </w:r>
-    </w:p>
-    <w:p>
-      <w:pPr>
-        <w:spacing w:before="0" w:after="160" w:line="264" w:lineRule="auto"/>
-      </w:pPr>
-      <w:r>
-        <w:rPr>
-          <w:rFonts w:ascii="Calibri" w:hAnsi="Calibri" w:eastAsia="Heiti TC"/>
+          <w:rFonts w:ascii="Calibri" w:hAnsi="Calibri" w:eastAsia="Arial Unicode MS"/>
           <w:b w:val="0"/>
           <w:i w:val="0"/>
           <w:color w:val="667085"/>
@@ -955,9 +955,9 @@
           <w:rPr>
             <w:color w:val="285B9D"/>
             <w:u w:val="single"/>
-            <w:rFonts w:eastAsia="Heiti TC" w:ascii="Calibri" w:hAnsi="Calibri"/>
+            <w:rFonts w:eastAsia="Arial Unicode MS" w:ascii="Calibri" w:hAnsi="Calibri"/>
           </w:rPr>
-          <w:t>reports/archive-6e4c2775eb89</w:t>
+          <w:t>reports/archive-72b276b899e5</w:t>
         </w:r>
       </w:hyperlink>
     </w:p>
@@ -967,13 +967,13 @@
       </w:pPr>
       <w:r>
         <w:rPr>
-          <w:rFonts w:ascii="Calibri" w:hAnsi="Calibri" w:eastAsia="Heiti TC"/>
+          <w:rFonts w:ascii="Calibri" w:hAnsi="Calibri" w:eastAsia="Arial Unicode MS"/>
           <w:b/>
           <w:i w:val="0"/>
           <w:color w:val="0B2545"/>
           <w:sz w:val="23"/>
         </w:rPr>
-        <w:t>5. 日报总编晨间标题核查：跨分析师议题提案</w:t>
+        <w:t>5. 2026-07-30 全球宏观开局卡：BEA数据前的Fed鹰派按兵不动</w:t>
       </w:r>
     </w:p>
     <w:p>
@@ -982,13 +982,13 @@
       </w:pPr>
       <w:r>
         <w:rPr>
-          <w:rFonts w:ascii="Calibri" w:hAnsi="Calibri" w:eastAsia="Heiti TC"/>
+          <w:rFonts w:ascii="Calibri" w:hAnsi="Calibri" w:eastAsia="Arial Unicode MS"/>
           <w:b w:val="0"/>
           <w:i w:val="0"/>
           <w:color w:val="667085"/>
           <w:sz w:val="17"/>
         </w:rPr>
-        <w:t>未识别 · 宏观通胀传导 · score 40.7</w:t>
+        <w:t>未识别 · 宏观通胀传导 · score 43.6</w:t>
       </w:r>
     </w:p>
     <w:p>
@@ -997,13 +997,13 @@
       </w:pPr>
       <w:r>
         <w:rPr>
-          <w:rFonts w:ascii="Calibri" w:hAnsi="Calibri" w:eastAsia="Heiti TC"/>
+          <w:rFonts w:ascii="Calibri" w:hAnsi="Calibri" w:eastAsia="Arial Unicode MS"/>
           <w:b w:val="0"/>
           <w:i w:val="0"/>
           <w:color w:val="334155"/>
           <w:sz w:val="20"/>
         </w:rPr>
-        <w:t>锚定日期：2026-07-30（本地 shell date +%Y-%m-%d ）。本报告中的“今日 / 隔夜 / 上一交易日 / 本周”均按该日期解释。上游分析师包 recent reports.md 已成功拉取并逐段阅读，文件为 922 行...</w:t>
+        <w:t>工作日期：2026-07-30，Asia/Singapore，已用本地命令 date +%Y-%m-%d 确认。本报告由 global-macro 撰写，研究问题是：Federal Reserve 在 2026-07-29 维持利率后，进入 2026-07-30 美国数据发...</w:t>
       </w:r>
     </w:p>
     <w:p>
@@ -1012,7 +1012,7 @@
       </w:pPr>
       <w:r>
         <w:rPr>
-          <w:rFonts w:ascii="Calibri" w:hAnsi="Calibri" w:eastAsia="Heiti TC"/>
+          <w:rFonts w:ascii="Calibri" w:hAnsi="Calibri" w:eastAsia="Arial Unicode MS"/>
           <w:b w:val="0"/>
           <w:i w:val="0"/>
           <w:color w:val="667085"/>
@@ -1025,9 +1025,9 @@
           <w:rPr>
             <w:color w:val="285B9D"/>
             <w:u w:val="single"/>
-            <w:rFonts w:eastAsia="Heiti TC" w:ascii="Calibri" w:hAnsi="Calibri"/>
+            <w:rFonts w:eastAsia="Arial Unicode MS" w:ascii="Calibri" w:hAnsi="Calibri"/>
           </w:rPr>
-          <w:t>reports/archive-43fa58ad1ed2</w:t>
+          <w:t>reports/archive-6a38fe8caa40</w:t>
         </w:r>
       </w:hyperlink>
     </w:p>
@@ -1037,13 +1037,13 @@
       </w:pPr>
       <w:r>
         <w:rPr>
-          <w:rFonts w:ascii="Calibri" w:hAnsi="Calibri" w:eastAsia="Heiti TC"/>
+          <w:rFonts w:ascii="Calibri" w:hAnsi="Calibri" w:eastAsia="Arial Unicode MS"/>
           <w:b/>
           <w:i w:val="0"/>
           <w:color w:val="0B2545"/>
           <w:sz w:val="23"/>
         </w:rPr>
-        <w:t>6. 偏鹰Fed按兵不动后的美元传导</w:t>
+        <w:t>6. 失去缓冲垫的 Warsh 美联储：把"加息尾部"定价进霍尔木兹石油冲击</w:t>
       </w:r>
     </w:p>
     <w:p>
@@ -1052,13 +1052,13 @@
       </w:pPr>
       <w:r>
         <w:rPr>
-          <w:rFonts w:ascii="Calibri" w:hAnsi="Calibri" w:eastAsia="Heiti TC"/>
+          <w:rFonts w:ascii="Calibri" w:hAnsi="Calibri" w:eastAsia="Arial Unicode MS"/>
           <w:b w:val="0"/>
           <w:i w:val="0"/>
           <w:color w:val="667085"/>
           <w:sz w:val="17"/>
         </w:rPr>
-        <w:t>未识别 · AI 基础设施 · score 40.2</w:t>
+        <w:t>未识别 · 宏观通胀传导 · score 43.5</w:t>
       </w:r>
     </w:p>
     <w:p>
@@ -1067,13 +1067,13 @@
       </w:pPr>
       <w:r>
         <w:rPr>
-          <w:rFonts w:ascii="Calibri" w:hAnsi="Calibri" w:eastAsia="Heiti TC"/>
+          <w:rFonts w:ascii="Calibri" w:hAnsi="Calibri" w:eastAsia="Arial Unicode MS"/>
           <w:b w:val="0"/>
           <w:i w:val="0"/>
           <w:color w:val="334155"/>
           <w:sz w:val="20"/>
         </w:rPr>
-        <w:t>研究记录 分析师： 全球宏观分析师（ global-macro ） · 立场： 压力测试（stress-test） 工作日期（Asia/Singapore）： 2026-07-30 问题： 如果7月Fed按兵不动是偏鹰而非偏鸽，哪些汇率对最容...</w:t>
+        <w:t>研究 Board 6686cc8b-c32d-49b5-b1db-44363039c885 · 研究记录 分析师 global-macro（全球宏观分析师）· 任务 central bank watch 工作日 2026-07-30（亚洲/新加坡）· 立场 initial</w:t>
       </w:r>
     </w:p>
     <w:p>
@@ -1082,7 +1082,7 @@
       </w:pPr>
       <w:r>
         <w:rPr>
-          <w:rFonts w:ascii="Calibri" w:hAnsi="Calibri" w:eastAsia="Heiti TC"/>
+          <w:rFonts w:ascii="Calibri" w:hAnsi="Calibri" w:eastAsia="Arial Unicode MS"/>
           <w:b w:val="0"/>
           <w:i w:val="0"/>
           <w:color w:val="667085"/>
@@ -1095,9 +1095,9 @@
           <w:rPr>
             <w:color w:val="285B9D"/>
             <w:u w:val="single"/>
-            <w:rFonts w:eastAsia="Heiti TC" w:ascii="Calibri" w:hAnsi="Calibri"/>
+            <w:rFonts w:eastAsia="Arial Unicode MS" w:ascii="Calibri" w:hAnsi="Calibri"/>
           </w:rPr>
-          <w:t>reports/archive-8f84ccc58f7a</w:t>
+          <w:t>reports/archive-e8b0abe5c727</w:t>
         </w:r>
       </w:hyperlink>
     </w:p>
@@ -1115,7 +1115,7 @@
       </w:pPr>
       <w:r>
         <w:rPr>
-          <w:rFonts w:ascii="Calibri" w:hAnsi="Calibri" w:eastAsia="Heiti TC"/>
+          <w:rFonts w:ascii="Calibri" w:hAnsi="Calibri" w:eastAsia="Arial Unicode MS"/>
           <w:b/>
           <w:i w:val="0"/>
           <w:color w:val="0B2545"/>
@@ -1130,7 +1130,7 @@
       </w:pPr>
       <w:r>
         <w:rPr>
-          <w:rFonts w:ascii="Calibri" w:hAnsi="Calibri" w:eastAsia="Heiti TC"/>
+          <w:rFonts w:ascii="Calibri" w:hAnsi="Calibri" w:eastAsia="Arial Unicode MS"/>
           <w:b w:val="0"/>
           <w:i w:val="0"/>
           <w:color w:val="334155"/>
@@ -1145,7 +1145,7 @@
       </w:pPr>
       <w:r>
         <w:rPr>
-          <w:rFonts w:ascii="Calibri" w:hAnsi="Calibri" w:eastAsia="Heiti TC"/>
+          <w:rFonts w:ascii="Calibri" w:hAnsi="Calibri" w:eastAsia="Arial Unicode MS"/>
           <w:b w:val="0"/>
           <w:i w:val="0"/>
           <w:color w:val="667085"/>
@@ -1158,7 +1158,7 @@
           <w:rPr>
             <w:color w:val="285B9D"/>
             <w:u w:val="single"/>
-            <w:rFonts w:eastAsia="Heiti TC" w:ascii="Calibri" w:hAnsi="Calibri"/>
+            <w:rFonts w:eastAsia="Arial Unicode MS" w:ascii="Calibri" w:hAnsi="Calibri"/>
           </w:rPr>
           <w:t>reports/archive-878095100273</w:t>
         </w:r>
@@ -1170,7 +1170,7 @@
       </w:pPr>
       <w:r>
         <w:rPr>
-          <w:rFonts w:ascii="Calibri" w:hAnsi="Calibri" w:eastAsia="Heiti TC"/>
+          <w:rFonts w:ascii="Calibri" w:hAnsi="Calibri" w:eastAsia="Arial Unicode MS"/>
           <w:b/>
           <w:i w:val="0"/>
           <w:color w:val="0B2545"/>
@@ -1185,7 +1185,7 @@
       </w:pPr>
       <w:r>
         <w:rPr>
-          <w:rFonts w:ascii="Calibri" w:hAnsi="Calibri" w:eastAsia="Heiti TC"/>
+          <w:rFonts w:ascii="Calibri" w:hAnsi="Calibri" w:eastAsia="Arial Unicode MS"/>
           <w:b w:val="0"/>
           <w:i w:val="0"/>
           <w:color w:val="334155"/>
@@ -1200,7 +1200,7 @@
       </w:pPr>
       <w:r>
         <w:rPr>
-          <w:rFonts w:ascii="Calibri" w:hAnsi="Calibri" w:eastAsia="Heiti TC"/>
+          <w:rFonts w:ascii="Calibri" w:hAnsi="Calibri" w:eastAsia="Arial Unicode MS"/>
           <w:b w:val="0"/>
           <w:i w:val="0"/>
           <w:color w:val="667085"/>
@@ -1213,7 +1213,7 @@
           <w:rPr>
             <w:color w:val="285B9D"/>
             <w:u w:val="single"/>
-            <w:rFonts w:eastAsia="Heiti TC" w:ascii="Calibri" w:hAnsi="Calibri"/>
+            <w:rFonts w:eastAsia="Arial Unicode MS" w:ascii="Calibri" w:hAnsi="Calibri"/>
           </w:rPr>
           <w:t>reports/archive-2edfd7e782e3</w:t>
         </w:r>
@@ -1225,7 +1225,7 @@
       </w:pPr>
       <w:r>
         <w:rPr>
-          <w:rFonts w:ascii="Calibri" w:hAnsi="Calibri" w:eastAsia="Heiti TC"/>
+          <w:rFonts w:ascii="Calibri" w:hAnsi="Calibri" w:eastAsia="Arial Unicode MS"/>
           <w:b/>
           <w:i w:val="0"/>
           <w:color w:val="0B2545"/>
@@ -1240,7 +1240,7 @@
       </w:pPr>
       <w:r>
         <w:rPr>
-          <w:rFonts w:ascii="Calibri" w:hAnsi="Calibri" w:eastAsia="Heiti TC"/>
+          <w:rFonts w:ascii="Calibri" w:hAnsi="Calibri" w:eastAsia="Arial Unicode MS"/>
           <w:b w:val="0"/>
           <w:i w:val="0"/>
           <w:color w:val="334155"/>
@@ -1255,7 +1255,7 @@
       </w:pPr>
       <w:r>
         <w:rPr>
-          <w:rFonts w:ascii="Calibri" w:hAnsi="Calibri" w:eastAsia="Heiti TC"/>
+          <w:rFonts w:ascii="Calibri" w:hAnsi="Calibri" w:eastAsia="Arial Unicode MS"/>
           <w:b w:val="0"/>
           <w:i w:val="0"/>
           <w:color w:val="667085"/>
@@ -1268,7 +1268,7 @@
           <w:rPr>
             <w:color w:val="285B9D"/>
             <w:u w:val="single"/>
-            <w:rFonts w:eastAsia="Heiti TC" w:ascii="Calibri" w:hAnsi="Calibri"/>
+            <w:rFonts w:eastAsia="Arial Unicode MS" w:ascii="Calibri" w:hAnsi="Calibri"/>
           </w:rPr>
           <w:t>reports/archive-38082c85b96a</w:t>
         </w:r>
@@ -1311,7 +1311,7 @@
             <w:r/>
             <w:r>
               <w:rPr>
-                <w:rFonts w:ascii="Calibri" w:hAnsi="Calibri" w:eastAsia="Heiti TC"/>
+                <w:rFonts w:ascii="Calibri" w:hAnsi="Calibri" w:eastAsia="Arial Unicode MS"/>
                 <w:b/>
                 <w:color w:val="475569"/>
                 <w:sz w:val="18"/>
@@ -1334,7 +1334,7 @@
             <w:r/>
             <w:r>
               <w:rPr>
-                <w:rFonts w:ascii="Calibri" w:hAnsi="Calibri" w:eastAsia="Heiti TC"/>
+                <w:rFonts w:ascii="Calibri" w:hAnsi="Calibri" w:eastAsia="Arial Unicode MS"/>
                 <w:b/>
                 <w:color w:val="475569"/>
                 <w:sz w:val="18"/>
@@ -1357,7 +1357,7 @@
             <w:r/>
             <w:r>
               <w:rPr>
-                <w:rFonts w:ascii="Calibri" w:hAnsi="Calibri" w:eastAsia="Heiti TC"/>
+                <w:rFonts w:ascii="Calibri" w:hAnsi="Calibri" w:eastAsia="Arial Unicode MS"/>
                 <w:b/>
                 <w:color w:val="475569"/>
                 <w:sz w:val="18"/>
@@ -1380,7 +1380,7 @@
             <w:r/>
             <w:r>
               <w:rPr>
-                <w:rFonts w:ascii="Calibri" w:hAnsi="Calibri" w:eastAsia="Heiti TC"/>
+                <w:rFonts w:ascii="Calibri" w:hAnsi="Calibri" w:eastAsia="Arial Unicode MS"/>
                 <w:b/>
                 <w:color w:val="475569"/>
                 <w:sz w:val="18"/>
@@ -1403,7 +1403,7 @@
             <w:r/>
             <w:r>
               <w:rPr>
-                <w:rFonts w:ascii="Calibri" w:hAnsi="Calibri" w:eastAsia="Heiti TC"/>
+                <w:rFonts w:ascii="Calibri" w:hAnsi="Calibri" w:eastAsia="Arial Unicode MS"/>
                 <w:b/>
                 <w:color w:val="475569"/>
                 <w:sz w:val="18"/>
@@ -1426,7 +1426,7 @@
             <w:r/>
             <w:r>
               <w:rPr>
-                <w:rFonts w:ascii="Calibri" w:hAnsi="Calibri" w:eastAsia="Heiti TC"/>
+                <w:rFonts w:ascii="Calibri" w:hAnsi="Calibri" w:eastAsia="Arial Unicode MS"/>
                 <w:b w:val="0"/>
                 <w:color w:val="111827"/>
                 <w:sz w:val="17"/>
@@ -1447,7 +1447,7 @@
             <w:r/>
             <w:r>
               <w:rPr>
-                <w:rFonts w:ascii="Calibri" w:hAnsi="Calibri" w:eastAsia="Heiti TC"/>
+                <w:rFonts w:ascii="Calibri" w:hAnsi="Calibri" w:eastAsia="Arial Unicode MS"/>
                 <w:b w:val="0"/>
                 <w:color w:val="111827"/>
                 <w:sz w:val="16"/>
@@ -1468,7 +1468,7 @@
             <w:r/>
             <w:r>
               <w:rPr>
-                <w:rFonts w:ascii="Calibri" w:hAnsi="Calibri" w:eastAsia="Heiti TC"/>
+                <w:rFonts w:ascii="Calibri" w:hAnsi="Calibri" w:eastAsia="Arial Unicode MS"/>
                 <w:b w:val="0"/>
                 <w:color w:val="111827"/>
                 <w:sz w:val="16"/>
@@ -1490,7 +1490,7 @@
             <w:r/>
             <w:r>
               <w:rPr>
-                <w:rFonts w:ascii="Calibri" w:hAnsi="Calibri" w:eastAsia="Heiti TC"/>
+                <w:rFonts w:ascii="Calibri" w:hAnsi="Calibri" w:eastAsia="Arial Unicode MS"/>
                 <w:b/>
                 <w:color w:val="111827"/>
                 <w:sz w:val="17"/>
@@ -1512,7 +1512,7 @@
             <w:r/>
             <w:r>
               <w:rPr>
-                <w:rFonts w:ascii="Calibri" w:hAnsi="Calibri" w:eastAsia="Heiti TC"/>
+                <w:rFonts w:ascii="Calibri" w:hAnsi="Calibri" w:eastAsia="Arial Unicode MS"/>
                 <w:b w:val="0"/>
                 <w:color w:val="111827"/>
                 <w:sz w:val="16"/>
@@ -1535,12 +1535,12 @@
             <w:r/>
             <w:r>
               <w:rPr>
-                <w:rFonts w:ascii="Calibri" w:hAnsi="Calibri" w:eastAsia="Heiti TC"/>
+                <w:rFonts w:ascii="Calibri" w:hAnsi="Calibri" w:eastAsia="Arial Unicode MS"/>
                 <w:b w:val="0"/>
                 <w:color w:val="111827"/>
                 <w:sz w:val="17"/>
               </w:rPr>
-              <w:t>2026-07-30 美股AI电力设备仓位压力测试</w:t>
+              <w:t>压力测试：五步现金释放瀑布下能源杠铃的执行压力与流动性约束</w:t>
             </w:r>
           </w:p>
         </w:tc>
@@ -1556,7 +1556,7 @@
             <w:r/>
             <w:r>
               <w:rPr>
-                <w:rFonts w:ascii="Calibri" w:hAnsi="Calibri" w:eastAsia="Heiti TC"/>
+                <w:rFonts w:ascii="Calibri" w:hAnsi="Calibri" w:eastAsia="Arial Unicode MS"/>
                 <w:b w:val="0"/>
                 <w:color w:val="111827"/>
                 <w:sz w:val="16"/>
@@ -1577,7 +1577,7 @@
             <w:r/>
             <w:r>
               <w:rPr>
-                <w:rFonts w:ascii="Calibri" w:hAnsi="Calibri" w:eastAsia="Heiti TC"/>
+                <w:rFonts w:ascii="Calibri" w:hAnsi="Calibri" w:eastAsia="Arial Unicode MS"/>
                 <w:b w:val="0"/>
                 <w:color w:val="111827"/>
                 <w:sz w:val="16"/>
@@ -1599,7 +1599,225 @@
             <w:r/>
             <w:r>
               <w:rPr>
-                <w:rFonts w:ascii="Calibri" w:hAnsi="Calibri" w:eastAsia="Heiti TC"/>
+                <w:rFonts w:ascii="Calibri" w:hAnsi="Calibri" w:eastAsia="Arial Unicode MS"/>
+                <w:b/>
+                <w:color w:val="111827"/>
+                <w:sz w:val="17"/>
+              </w:rPr>
+              <w:t>45.4</w:t>
+            </w:r>
+          </w:p>
+        </w:tc>
+        <w:tc>
+          <w:tcPr>
+            <w:tcW w:type="dxa" w:w="1500"/>
+            <w:vAlign w:val="center"/>
+          </w:tcPr>
+          <w:p>
+            <w:pPr>
+              <w:spacing w:before="0" w:after="0"/>
+              <w:jc w:val="center"/>
+            </w:pPr>
+            <w:r/>
+            <w:r>
+              <w:rPr>
+                <w:rFonts w:ascii="Calibri" w:hAnsi="Calibri" w:eastAsia="Arial Unicode MS"/>
+                <w:b w:val="0"/>
+                <w:color w:val="111827"/>
+                <w:sz w:val="16"/>
+              </w:rPr>
+              <w:t>风险 3</w:t>
+            </w:r>
+          </w:p>
+        </w:tc>
+      </w:tr>
+      <w:tr>
+        <w:tc>
+          <w:tcPr>
+            <w:tcW w:type="dxa" w:w="3720"/>
+            <w:vAlign w:val="center"/>
+          </w:tcPr>
+          <w:p>
+            <w:pPr>
+              <w:spacing w:before="0" w:after="0"/>
+            </w:pPr>
+            <w:r/>
+            <w:r>
+              <w:rPr>
+                <w:rFonts w:ascii="Calibri" w:hAnsi="Calibri" w:eastAsia="Arial Unicode MS"/>
+                <w:b w:val="0"/>
+                <w:color w:val="111827"/>
+                <w:sz w:val="17"/>
+              </w:rPr>
+              <w:t>霍尔木兹石油溢价:可持续性与情景油价路径</w:t>
+            </w:r>
+          </w:p>
+        </w:tc>
+        <w:tc>
+          <w:tcPr>
+            <w:tcW w:type="dxa" w:w="1560"/>
+            <w:vAlign w:val="center"/>
+          </w:tcPr>
+          <w:p>
+            <w:pPr>
+              <w:spacing w:before="0" w:after="0"/>
+            </w:pPr>
+            <w:r/>
+            <w:r>
+              <w:rPr>
+                <w:rFonts w:ascii="Calibri" w:hAnsi="Calibri" w:eastAsia="Arial Unicode MS"/>
+                <w:b w:val="0"/>
+                <w:color w:val="111827"/>
+                <w:sz w:val="16"/>
+              </w:rPr>
+              <w:t>未识别</w:t>
+            </w:r>
+          </w:p>
+        </w:tc>
+        <w:tc>
+          <w:tcPr>
+            <w:tcW w:type="dxa" w:w="1680"/>
+            <w:vAlign w:val="center"/>
+          </w:tcPr>
+          <w:p>
+            <w:pPr>
+              <w:spacing w:before="0" w:after="0"/>
+            </w:pPr>
+            <w:r/>
+            <w:r>
+              <w:rPr>
+                <w:rFonts w:ascii="Calibri" w:hAnsi="Calibri" w:eastAsia="Arial Unicode MS"/>
+                <w:b w:val="0"/>
+                <w:color w:val="111827"/>
+                <w:sz w:val="16"/>
+              </w:rPr>
+              <w:t>宏观通胀传导</w:t>
+            </w:r>
+          </w:p>
+        </w:tc>
+        <w:tc>
+          <w:tcPr>
+            <w:tcW w:type="dxa" w:w="900"/>
+            <w:vAlign w:val="center"/>
+          </w:tcPr>
+          <w:p>
+            <w:pPr>
+              <w:spacing w:before="0" w:after="0"/>
+              <w:jc w:val="center"/>
+            </w:pPr>
+            <w:r/>
+            <w:r>
+              <w:rPr>
+                <w:rFonts w:ascii="Calibri" w:hAnsi="Calibri" w:eastAsia="Arial Unicode MS"/>
+                <w:b/>
+                <w:color w:val="111827"/>
+                <w:sz w:val="17"/>
+              </w:rPr>
+              <w:t>45.3</w:t>
+            </w:r>
+          </w:p>
+        </w:tc>
+        <w:tc>
+          <w:tcPr>
+            <w:tcW w:type="dxa" w:w="1500"/>
+            <w:vAlign w:val="center"/>
+          </w:tcPr>
+          <w:p>
+            <w:pPr>
+              <w:spacing w:before="0" w:after="0"/>
+              <w:jc w:val="center"/>
+            </w:pPr>
+            <w:r/>
+            <w:r>
+              <w:rPr>
+                <w:rFonts w:ascii="Calibri" w:hAnsi="Calibri" w:eastAsia="Arial Unicode MS"/>
+                <w:b w:val="0"/>
+                <w:color w:val="111827"/>
+                <w:sz w:val="16"/>
+              </w:rPr>
+              <w:t>风险 2</w:t>
+            </w:r>
+          </w:p>
+        </w:tc>
+      </w:tr>
+      <w:tr>
+        <w:tc>
+          <w:tcPr>
+            <w:tcW w:type="dxa" w:w="3720"/>
+            <w:vAlign w:val="center"/>
+          </w:tcPr>
+          <w:p>
+            <w:pPr>
+              <w:spacing w:before="0" w:after="0"/>
+            </w:pPr>
+            <w:r/>
+            <w:r>
+              <w:rPr>
+                <w:rFonts w:ascii="Calibri" w:hAnsi="Calibri" w:eastAsia="Arial Unicode MS"/>
+                <w:b w:val="0"/>
+                <w:color w:val="111827"/>
+                <w:sz w:val="17"/>
+              </w:rPr>
+              <w:t>2026-07-30 美股AI电力设备仓位压力测试</w:t>
+            </w:r>
+          </w:p>
+        </w:tc>
+        <w:tc>
+          <w:tcPr>
+            <w:tcW w:type="dxa" w:w="1560"/>
+            <w:vAlign w:val="center"/>
+          </w:tcPr>
+          <w:p>
+            <w:pPr>
+              <w:spacing w:before="0" w:after="0"/>
+            </w:pPr>
+            <w:r/>
+            <w:r>
+              <w:rPr>
+                <w:rFonts w:ascii="Calibri" w:hAnsi="Calibri" w:eastAsia="Arial Unicode MS"/>
+                <w:b w:val="0"/>
+                <w:color w:val="111827"/>
+                <w:sz w:val="16"/>
+              </w:rPr>
+              <w:t>未识别</w:t>
+            </w:r>
+          </w:p>
+        </w:tc>
+        <w:tc>
+          <w:tcPr>
+            <w:tcW w:type="dxa" w:w="1680"/>
+            <w:vAlign w:val="center"/>
+          </w:tcPr>
+          <w:p>
+            <w:pPr>
+              <w:spacing w:before="0" w:after="0"/>
+            </w:pPr>
+            <w:r/>
+            <w:r>
+              <w:rPr>
+                <w:rFonts w:ascii="Calibri" w:hAnsi="Calibri" w:eastAsia="Arial Unicode MS"/>
+                <w:b w:val="0"/>
+                <w:color w:val="111827"/>
+                <w:sz w:val="16"/>
+              </w:rPr>
+              <w:t>宏观通胀传导</w:t>
+            </w:r>
+          </w:p>
+        </w:tc>
+        <w:tc>
+          <w:tcPr>
+            <w:tcW w:type="dxa" w:w="900"/>
+            <w:vAlign w:val="center"/>
+          </w:tcPr>
+          <w:p>
+            <w:pPr>
+              <w:spacing w:before="0" w:after="0"/>
+              <w:jc w:val="center"/>
+            </w:pPr>
+            <w:r/>
+            <w:r>
+              <w:rPr>
+                <w:rFonts w:ascii="Calibri" w:hAnsi="Calibri" w:eastAsia="Arial Unicode MS"/>
                 <w:b/>
                 <w:color w:val="111827"/>
                 <w:sz w:val="17"/>
@@ -1621,7 +1839,7 @@
             <w:r/>
             <w:r>
               <w:rPr>
-                <w:rFonts w:ascii="Calibri" w:hAnsi="Calibri" w:eastAsia="Heiti TC"/>
+                <w:rFonts w:ascii="Calibri" w:hAnsi="Calibri" w:eastAsia="Arial Unicode MS"/>
                 <w:b w:val="0"/>
                 <w:color w:val="111827"/>
                 <w:sz w:val="16"/>
@@ -1644,7 +1862,443 @@
             <w:r/>
             <w:r>
               <w:rPr>
-                <w:rFonts w:ascii="Calibri" w:hAnsi="Calibri" w:eastAsia="Heiti TC"/>
+                <w:rFonts w:ascii="Calibri" w:hAnsi="Calibri" w:eastAsia="Arial Unicode MS"/>
+                <w:b w:val="0"/>
+                <w:color w:val="111827"/>
+                <w:sz w:val="17"/>
+              </w:rPr>
+              <w:t>2026-07-30 全球宏观开局卡：BEA数据前的Fed鹰派按兵不动</w:t>
+            </w:r>
+          </w:p>
+        </w:tc>
+        <w:tc>
+          <w:tcPr>
+            <w:tcW w:type="dxa" w:w="1560"/>
+            <w:vAlign w:val="center"/>
+          </w:tcPr>
+          <w:p>
+            <w:pPr>
+              <w:spacing w:before="0" w:after="0"/>
+            </w:pPr>
+            <w:r/>
+            <w:r>
+              <w:rPr>
+                <w:rFonts w:ascii="Calibri" w:hAnsi="Calibri" w:eastAsia="Arial Unicode MS"/>
+                <w:b w:val="0"/>
+                <w:color w:val="111827"/>
+                <w:sz w:val="16"/>
+              </w:rPr>
+              <w:t>未识别</w:t>
+            </w:r>
+          </w:p>
+        </w:tc>
+        <w:tc>
+          <w:tcPr>
+            <w:tcW w:type="dxa" w:w="1680"/>
+            <w:vAlign w:val="center"/>
+          </w:tcPr>
+          <w:p>
+            <w:pPr>
+              <w:spacing w:before="0" w:after="0"/>
+            </w:pPr>
+            <w:r/>
+            <w:r>
+              <w:rPr>
+                <w:rFonts w:ascii="Calibri" w:hAnsi="Calibri" w:eastAsia="Arial Unicode MS"/>
+                <w:b w:val="0"/>
+                <w:color w:val="111827"/>
+                <w:sz w:val="16"/>
+              </w:rPr>
+              <w:t>宏观通胀传导</w:t>
+            </w:r>
+          </w:p>
+        </w:tc>
+        <w:tc>
+          <w:tcPr>
+            <w:tcW w:type="dxa" w:w="900"/>
+            <w:vAlign w:val="center"/>
+          </w:tcPr>
+          <w:p>
+            <w:pPr>
+              <w:spacing w:before="0" w:after="0"/>
+              <w:jc w:val="center"/>
+            </w:pPr>
+            <w:r/>
+            <w:r>
+              <w:rPr>
+                <w:rFonts w:ascii="Calibri" w:hAnsi="Calibri" w:eastAsia="Arial Unicode MS"/>
+                <w:b/>
+                <w:color w:val="111827"/>
+                <w:sz w:val="17"/>
+              </w:rPr>
+              <w:t>43.6</w:t>
+            </w:r>
+          </w:p>
+        </w:tc>
+        <w:tc>
+          <w:tcPr>
+            <w:tcW w:type="dxa" w:w="1500"/>
+            <w:vAlign w:val="center"/>
+          </w:tcPr>
+          <w:p>
+            <w:pPr>
+              <w:spacing w:before="0" w:after="0"/>
+              <w:jc w:val="center"/>
+            </w:pPr>
+            <w:r/>
+            <w:r>
+              <w:rPr>
+                <w:rFonts w:ascii="Calibri" w:hAnsi="Calibri" w:eastAsia="Arial Unicode MS"/>
+                <w:b w:val="0"/>
+                <w:color w:val="111827"/>
+                <w:sz w:val="16"/>
+              </w:rPr>
+              <w:t>风险 1</w:t>
+            </w:r>
+          </w:p>
+        </w:tc>
+      </w:tr>
+      <w:tr>
+        <w:tc>
+          <w:tcPr>
+            <w:tcW w:type="dxa" w:w="3720"/>
+            <w:vAlign w:val="center"/>
+          </w:tcPr>
+          <w:p>
+            <w:pPr>
+              <w:spacing w:before="0" w:after="0"/>
+            </w:pPr>
+            <w:r/>
+            <w:r>
+              <w:rPr>
+                <w:rFonts w:ascii="Calibri" w:hAnsi="Calibri" w:eastAsia="Arial Unicode MS"/>
+                <w:b w:val="0"/>
+                <w:color w:val="111827"/>
+                <w:sz w:val="17"/>
+              </w:rPr>
+              <w:t>失去缓冲垫的 Warsh 美联储：把"加息尾部"定价进霍尔木兹石油冲击</w:t>
+            </w:r>
+          </w:p>
+        </w:tc>
+        <w:tc>
+          <w:tcPr>
+            <w:tcW w:type="dxa" w:w="1560"/>
+            <w:vAlign w:val="center"/>
+          </w:tcPr>
+          <w:p>
+            <w:pPr>
+              <w:spacing w:before="0" w:after="0"/>
+            </w:pPr>
+            <w:r/>
+            <w:r>
+              <w:rPr>
+                <w:rFonts w:ascii="Calibri" w:hAnsi="Calibri" w:eastAsia="Arial Unicode MS"/>
+                <w:b w:val="0"/>
+                <w:color w:val="111827"/>
+                <w:sz w:val="16"/>
+              </w:rPr>
+              <w:t>未识别</w:t>
+            </w:r>
+          </w:p>
+        </w:tc>
+        <w:tc>
+          <w:tcPr>
+            <w:tcW w:type="dxa" w:w="1680"/>
+            <w:vAlign w:val="center"/>
+          </w:tcPr>
+          <w:p>
+            <w:pPr>
+              <w:spacing w:before="0" w:after="0"/>
+            </w:pPr>
+            <w:r/>
+            <w:r>
+              <w:rPr>
+                <w:rFonts w:ascii="Calibri" w:hAnsi="Calibri" w:eastAsia="Arial Unicode MS"/>
+                <w:b w:val="0"/>
+                <w:color w:val="111827"/>
+                <w:sz w:val="16"/>
+              </w:rPr>
+              <w:t>宏观通胀传导</w:t>
+            </w:r>
+          </w:p>
+        </w:tc>
+        <w:tc>
+          <w:tcPr>
+            <w:tcW w:type="dxa" w:w="900"/>
+            <w:vAlign w:val="center"/>
+          </w:tcPr>
+          <w:p>
+            <w:pPr>
+              <w:spacing w:before="0" w:after="0"/>
+              <w:jc w:val="center"/>
+            </w:pPr>
+            <w:r/>
+            <w:r>
+              <w:rPr>
+                <w:rFonts w:ascii="Calibri" w:hAnsi="Calibri" w:eastAsia="Arial Unicode MS"/>
+                <w:b/>
+                <w:color w:val="111827"/>
+                <w:sz w:val="17"/>
+              </w:rPr>
+              <w:t>43.5</w:t>
+            </w:r>
+          </w:p>
+        </w:tc>
+        <w:tc>
+          <w:tcPr>
+            <w:tcW w:type="dxa" w:w="1500"/>
+            <w:vAlign w:val="center"/>
+          </w:tcPr>
+          <w:p>
+            <w:pPr>
+              <w:spacing w:before="0" w:after="0"/>
+              <w:jc w:val="center"/>
+            </w:pPr>
+            <w:r/>
+            <w:r>
+              <w:rPr>
+                <w:rFonts w:ascii="Calibri" w:hAnsi="Calibri" w:eastAsia="Arial Unicode MS"/>
+                <w:b w:val="0"/>
+                <w:color w:val="111827"/>
+                <w:sz w:val="16"/>
+              </w:rPr>
+              <w:t>风险 1</w:t>
+            </w:r>
+          </w:p>
+        </w:tc>
+      </w:tr>
+      <w:tr>
+        <w:tc>
+          <w:tcPr>
+            <w:tcW w:type="dxa" w:w="3720"/>
+            <w:vAlign w:val="center"/>
+          </w:tcPr>
+          <w:p>
+            <w:pPr>
+              <w:spacing w:before="0" w:after="0"/>
+            </w:pPr>
+            <w:r/>
+            <w:r>
+              <w:rPr>
+                <w:rFonts w:ascii="Calibri" w:hAnsi="Calibri" w:eastAsia="Arial Unicode MS"/>
+                <w:b w:val="0"/>
+                <w:color w:val="111827"/>
+                <w:sz w:val="17"/>
+              </w:rPr>
+              <w:t>从曲线判断→油价分布→反应函数，综合为一套按风险定量的跨资产头寸</w:t>
+            </w:r>
+          </w:p>
+        </w:tc>
+        <w:tc>
+          <w:tcPr>
+            <w:tcW w:type="dxa" w:w="1560"/>
+            <w:vAlign w:val="center"/>
+          </w:tcPr>
+          <w:p>
+            <w:pPr>
+              <w:spacing w:before="0" w:after="0"/>
+            </w:pPr>
+            <w:r/>
+            <w:r>
+              <w:rPr>
+                <w:rFonts w:ascii="Calibri" w:hAnsi="Calibri" w:eastAsia="Arial Unicode MS"/>
+                <w:b w:val="0"/>
+                <w:color w:val="111827"/>
+                <w:sz w:val="16"/>
+              </w:rPr>
+              <w:t>未识别</w:t>
+            </w:r>
+          </w:p>
+        </w:tc>
+        <w:tc>
+          <w:tcPr>
+            <w:tcW w:type="dxa" w:w="1680"/>
+            <w:vAlign w:val="center"/>
+          </w:tcPr>
+          <w:p>
+            <w:pPr>
+              <w:spacing w:before="0" w:after="0"/>
+            </w:pPr>
+            <w:r/>
+            <w:r>
+              <w:rPr>
+                <w:rFonts w:ascii="Calibri" w:hAnsi="Calibri" w:eastAsia="Arial Unicode MS"/>
+                <w:b w:val="0"/>
+                <w:color w:val="111827"/>
+                <w:sz w:val="16"/>
+              </w:rPr>
+              <w:t>宏观通胀传导</w:t>
+            </w:r>
+          </w:p>
+        </w:tc>
+        <w:tc>
+          <w:tcPr>
+            <w:tcW w:type="dxa" w:w="900"/>
+            <w:vAlign w:val="center"/>
+          </w:tcPr>
+          <w:p>
+            <w:pPr>
+              <w:spacing w:before="0" w:after="0"/>
+              <w:jc w:val="center"/>
+            </w:pPr>
+            <w:r/>
+            <w:r>
+              <w:rPr>
+                <w:rFonts w:ascii="Calibri" w:hAnsi="Calibri" w:eastAsia="Arial Unicode MS"/>
+                <w:b/>
+                <w:color w:val="111827"/>
+                <w:sz w:val="17"/>
+              </w:rPr>
+              <w:t>43.1</w:t>
+            </w:r>
+          </w:p>
+        </w:tc>
+        <w:tc>
+          <w:tcPr>
+            <w:tcW w:type="dxa" w:w="1500"/>
+            <w:vAlign w:val="center"/>
+          </w:tcPr>
+          <w:p>
+            <w:pPr>
+              <w:spacing w:before="0" w:after="0"/>
+              <w:jc w:val="center"/>
+            </w:pPr>
+            <w:r/>
+            <w:r>
+              <w:rPr>
+                <w:rFonts w:ascii="Calibri" w:hAnsi="Calibri" w:eastAsia="Arial Unicode MS"/>
+                <w:b w:val="0"/>
+                <w:color w:val="111827"/>
+                <w:sz w:val="16"/>
+              </w:rPr>
+              <w:t>风险 1</w:t>
+            </w:r>
+          </w:p>
+        </w:tc>
+      </w:tr>
+      <w:tr>
+        <w:tc>
+          <w:tcPr>
+            <w:tcW w:type="dxa" w:w="3720"/>
+            <w:vAlign w:val="center"/>
+          </w:tcPr>
+          <w:p>
+            <w:pPr>
+              <w:spacing w:before="0" w:after="0"/>
+            </w:pPr>
+            <w:r/>
+            <w:r>
+              <w:rPr>
+                <w:rFonts w:ascii="Calibri" w:hAnsi="Calibri" w:eastAsia="Arial Unicode MS"/>
+                <w:b w:val="0"/>
+                <w:color w:val="111827"/>
+                <w:sz w:val="17"/>
+              </w:rPr>
+              <w:t>2026-07-30 — 压力测试"不动 AI/出口收益核心"这一假设</w:t>
+            </w:r>
+          </w:p>
+        </w:tc>
+        <w:tc>
+          <w:tcPr>
+            <w:tcW w:type="dxa" w:w="1560"/>
+            <w:vAlign w:val="center"/>
+          </w:tcPr>
+          <w:p>
+            <w:pPr>
+              <w:spacing w:before="0" w:after="0"/>
+            </w:pPr>
+            <w:r/>
+            <w:r>
+              <w:rPr>
+                <w:rFonts w:ascii="Calibri" w:hAnsi="Calibri" w:eastAsia="Arial Unicode MS"/>
+                <w:b w:val="0"/>
+                <w:color w:val="111827"/>
+                <w:sz w:val="16"/>
+              </w:rPr>
+              <w:t>未识别</w:t>
+            </w:r>
+          </w:p>
+        </w:tc>
+        <w:tc>
+          <w:tcPr>
+            <w:tcW w:type="dxa" w:w="1680"/>
+            <w:vAlign w:val="center"/>
+          </w:tcPr>
+          <w:p>
+            <w:pPr>
+              <w:spacing w:before="0" w:after="0"/>
+            </w:pPr>
+            <w:r/>
+            <w:r>
+              <w:rPr>
+                <w:rFonts w:ascii="Calibri" w:hAnsi="Calibri" w:eastAsia="Arial Unicode MS"/>
+                <w:b w:val="0"/>
+                <w:color w:val="111827"/>
+                <w:sz w:val="16"/>
+              </w:rPr>
+              <w:t>宏观通胀传导</w:t>
+            </w:r>
+          </w:p>
+        </w:tc>
+        <w:tc>
+          <w:tcPr>
+            <w:tcW w:type="dxa" w:w="900"/>
+            <w:vAlign w:val="center"/>
+          </w:tcPr>
+          <w:p>
+            <w:pPr>
+              <w:spacing w:before="0" w:after="0"/>
+              <w:jc w:val="center"/>
+            </w:pPr>
+            <w:r/>
+            <w:r>
+              <w:rPr>
+                <w:rFonts w:ascii="Calibri" w:hAnsi="Calibri" w:eastAsia="Arial Unicode MS"/>
+                <w:b/>
+                <w:color w:val="111827"/>
+                <w:sz w:val="17"/>
+              </w:rPr>
+              <w:t>42.9</w:t>
+            </w:r>
+          </w:p>
+        </w:tc>
+        <w:tc>
+          <w:tcPr>
+            <w:tcW w:type="dxa" w:w="1500"/>
+            <w:vAlign w:val="center"/>
+          </w:tcPr>
+          <w:p>
+            <w:pPr>
+              <w:spacing w:before="0" w:after="0"/>
+              <w:jc w:val="center"/>
+            </w:pPr>
+            <w:r/>
+            <w:r>
+              <w:rPr>
+                <w:rFonts w:ascii="Calibri" w:hAnsi="Calibri" w:eastAsia="Arial Unicode MS"/>
+                <w:b w:val="0"/>
+                <w:color w:val="111827"/>
+                <w:sz w:val="16"/>
+              </w:rPr>
+              <w:t>风险 1</w:t>
+            </w:r>
+          </w:p>
+        </w:tc>
+      </w:tr>
+      <w:tr>
+        <w:tc>
+          <w:tcPr>
+            <w:tcW w:type="dxa" w:w="3720"/>
+            <w:vAlign w:val="center"/>
+          </w:tcPr>
+          <w:p>
+            <w:pPr>
+              <w:spacing w:before="0" w:after="0"/>
+            </w:pPr>
+            <w:r/>
+            <w:r>
+              <w:rPr>
+                <w:rFonts w:ascii="Calibri" w:hAnsi="Calibri" w:eastAsia="Arial Unicode MS"/>
                 <w:b w:val="0"/>
                 <w:color w:val="111827"/>
                 <w:sz w:val="17"/>
@@ -1665,7 +2319,7 @@
             <w:r/>
             <w:r>
               <w:rPr>
-                <w:rFonts w:ascii="Calibri" w:hAnsi="Calibri" w:eastAsia="Heiti TC"/>
+                <w:rFonts w:ascii="Calibri" w:hAnsi="Calibri" w:eastAsia="Arial Unicode MS"/>
                 <w:b w:val="0"/>
                 <w:color w:val="111827"/>
                 <w:sz w:val="16"/>
@@ -1686,7 +2340,7 @@
             <w:r/>
             <w:r>
               <w:rPr>
-                <w:rFonts w:ascii="Calibri" w:hAnsi="Calibri" w:eastAsia="Heiti TC"/>
+                <w:rFonts w:ascii="Calibri" w:hAnsi="Calibri" w:eastAsia="Arial Unicode MS"/>
                 <w:b w:val="0"/>
                 <w:color w:val="111827"/>
                 <w:sz w:val="16"/>
@@ -1708,7 +2362,7 @@
             <w:r/>
             <w:r>
               <w:rPr>
-                <w:rFonts w:ascii="Calibri" w:hAnsi="Calibri" w:eastAsia="Heiti TC"/>
+                <w:rFonts w:ascii="Calibri" w:hAnsi="Calibri" w:eastAsia="Arial Unicode MS"/>
                 <w:b/>
                 <w:color w:val="111827"/>
                 <w:sz w:val="17"/>
@@ -1730,7 +2384,7 @@
             <w:r/>
             <w:r>
               <w:rPr>
-                <w:rFonts w:ascii="Calibri" w:hAnsi="Calibri" w:eastAsia="Heiti TC"/>
+                <w:rFonts w:ascii="Calibri" w:hAnsi="Calibri" w:eastAsia="Arial Unicode MS"/>
                 <w:b w:val="0"/>
                 <w:color w:val="111827"/>
                 <w:sz w:val="16"/>
@@ -1753,12 +2407,12 @@
             <w:r/>
             <w:r>
               <w:rPr>
-                <w:rFonts w:ascii="Calibri" w:hAnsi="Calibri" w:eastAsia="Heiti TC"/>
+                <w:rFonts w:ascii="Calibri" w:hAnsi="Calibri" w:eastAsia="Arial Unicode MS"/>
                 <w:b w:val="0"/>
                 <w:color w:val="111827"/>
                 <w:sz w:val="17"/>
               </w:rPr>
-              <w:t>research discussion Session Brief</w:t>
+              <w:t>主要大宗商品价格走势及供需变化</w:t>
             </w:r>
           </w:p>
         </w:tc>
@@ -1774,7 +2428,7 @@
             <w:r/>
             <w:r>
               <w:rPr>
-                <w:rFonts w:ascii="Calibri" w:hAnsi="Calibri" w:eastAsia="Heiti TC"/>
+                <w:rFonts w:ascii="Calibri" w:hAnsi="Calibri" w:eastAsia="Arial Unicode MS"/>
                 <w:b w:val="0"/>
                 <w:color w:val="111827"/>
                 <w:sz w:val="16"/>
@@ -1795,7 +2449,7 @@
             <w:r/>
             <w:r>
               <w:rPr>
-                <w:rFonts w:ascii="Calibri" w:hAnsi="Calibri" w:eastAsia="Heiti TC"/>
+                <w:rFonts w:ascii="Calibri" w:hAnsi="Calibri" w:eastAsia="Arial Unicode MS"/>
                 <w:b w:val="0"/>
                 <w:color w:val="111827"/>
                 <w:sz w:val="16"/>
@@ -1817,12 +2471,12 @@
             <w:r/>
             <w:r>
               <w:rPr>
-                <w:rFonts w:ascii="Calibri" w:hAnsi="Calibri" w:eastAsia="Heiti TC"/>
+                <w:rFonts w:ascii="Calibri" w:hAnsi="Calibri" w:eastAsia="Arial Unicode MS"/>
                 <w:b/>
                 <w:color w:val="111827"/>
                 <w:sz w:val="17"/>
               </w:rPr>
-              <w:t>42.1</w:t>
+              <w:t>42.7</w:t>
             </w:r>
           </w:p>
         </w:tc>
@@ -1839,7 +2493,7 @@
             <w:r/>
             <w:r>
               <w:rPr>
-                <w:rFonts w:ascii="Calibri" w:hAnsi="Calibri" w:eastAsia="Heiti TC"/>
+                <w:rFonts w:ascii="Calibri" w:hAnsi="Calibri" w:eastAsia="Arial Unicode MS"/>
                 <w:b w:val="0"/>
                 <w:color w:val="111827"/>
                 <w:sz w:val="16"/>
@@ -1862,12 +2516,12 @@
             <w:r/>
             <w:r>
               <w:rPr>
-                <w:rFonts w:ascii="Calibri" w:hAnsi="Calibri" w:eastAsia="Heiti TC"/>
+                <w:rFonts w:ascii="Calibri" w:hAnsi="Calibri" w:eastAsia="Arial Unicode MS"/>
                 <w:b w:val="0"/>
                 <w:color w:val="111827"/>
                 <w:sz w:val="17"/>
               </w:rPr>
-              <w:t>日报总编晨间标题核查：跨分析师议题提案</w:t>
+              <w:t>研究记录 03 GDP/PCE 对利率与信用的验证窗口 - 2026-07-30 [S1]</w:t>
             </w:r>
           </w:p>
         </w:tc>
@@ -1883,7 +2537,7 @@
             <w:r/>
             <w:r>
               <w:rPr>
-                <w:rFonts w:ascii="Calibri" w:hAnsi="Calibri" w:eastAsia="Heiti TC"/>
+                <w:rFonts w:ascii="Calibri" w:hAnsi="Calibri" w:eastAsia="Arial Unicode MS"/>
                 <w:b w:val="0"/>
                 <w:color w:val="111827"/>
                 <w:sz w:val="16"/>
@@ -1904,7 +2558,7 @@
             <w:r/>
             <w:r>
               <w:rPr>
-                <w:rFonts w:ascii="Calibri" w:hAnsi="Calibri" w:eastAsia="Heiti TC"/>
+                <w:rFonts w:ascii="Calibri" w:hAnsi="Calibri" w:eastAsia="Arial Unicode MS"/>
                 <w:b w:val="0"/>
                 <w:color w:val="111827"/>
                 <w:sz w:val="16"/>
@@ -1926,12 +2580,12 @@
             <w:r/>
             <w:r>
               <w:rPr>
-                <w:rFonts w:ascii="Calibri" w:hAnsi="Calibri" w:eastAsia="Heiti TC"/>
+                <w:rFonts w:ascii="Calibri" w:hAnsi="Calibri" w:eastAsia="Arial Unicode MS"/>
                 <w:b/>
                 <w:color w:val="111827"/>
                 <w:sz w:val="17"/>
               </w:rPr>
-              <w:t>40.7</w:t>
+              <w:t>42.6</w:t>
             </w:r>
           </w:p>
         </w:tc>
@@ -1948,7 +2602,7 @@
             <w:r/>
             <w:r>
               <w:rPr>
-                <w:rFonts w:ascii="Calibri" w:hAnsi="Calibri" w:eastAsia="Heiti TC"/>
+                <w:rFonts w:ascii="Calibri" w:hAnsi="Calibri" w:eastAsia="Arial Unicode MS"/>
                 <w:b w:val="0"/>
                 <w:color w:val="111827"/>
                 <w:sz w:val="16"/>
@@ -1971,12 +2625,12 @@
             <w:r/>
             <w:r>
               <w:rPr>
-                <w:rFonts w:ascii="Calibri" w:hAnsi="Calibri" w:eastAsia="Heiti TC"/>
+                <w:rFonts w:ascii="Calibri" w:hAnsi="Calibri" w:eastAsia="Arial Unicode MS"/>
                 <w:b w:val="0"/>
                 <w:color w:val="111827"/>
                 <w:sz w:val="17"/>
               </w:rPr>
-              <w:t>偏鹰Fed按兵不动后的美元传导</w:t>
+              <w:t>2026-07-30 全球宏观压力测试：油价、利率与美国高收益利差</w:t>
             </w:r>
           </w:p>
         </w:tc>
@@ -1992,7 +2646,7 @@
             <w:r/>
             <w:r>
               <w:rPr>
-                <w:rFonts w:ascii="Calibri" w:hAnsi="Calibri" w:eastAsia="Heiti TC"/>
+                <w:rFonts w:ascii="Calibri" w:hAnsi="Calibri" w:eastAsia="Arial Unicode MS"/>
                 <w:b w:val="0"/>
                 <w:color w:val="111827"/>
                 <w:sz w:val="16"/>
@@ -2013,116 +2667,7 @@
             <w:r/>
             <w:r>
               <w:rPr>
-                <w:rFonts w:ascii="Calibri" w:hAnsi="Calibri" w:eastAsia="Heiti TC"/>
-                <w:b w:val="0"/>
-                <w:color w:val="111827"/>
-                <w:sz w:val="16"/>
-              </w:rPr>
-              <w:t>AI 基础设施</w:t>
-            </w:r>
-          </w:p>
-        </w:tc>
-        <w:tc>
-          <w:tcPr>
-            <w:tcW w:type="dxa" w:w="900"/>
-            <w:vAlign w:val="center"/>
-          </w:tcPr>
-          <w:p>
-            <w:pPr>
-              <w:spacing w:before="0" w:after="0"/>
-              <w:jc w:val="center"/>
-            </w:pPr>
-            <w:r/>
-            <w:r>
-              <w:rPr>
-                <w:rFonts w:ascii="Calibri" w:hAnsi="Calibri" w:eastAsia="Heiti TC"/>
-                <w:b/>
-                <w:color w:val="111827"/>
-                <w:sz w:val="17"/>
-              </w:rPr>
-              <w:t>40.2</w:t>
-            </w:r>
-          </w:p>
-        </w:tc>
-        <w:tc>
-          <w:tcPr>
-            <w:tcW w:type="dxa" w:w="1500"/>
-            <w:vAlign w:val="center"/>
-          </w:tcPr>
-          <w:p>
-            <w:pPr>
-              <w:spacing w:before="0" w:after="0"/>
-              <w:jc w:val="center"/>
-            </w:pPr>
-            <w:r/>
-            <w:r>
-              <w:rPr>
-                <w:rFonts w:ascii="Calibri" w:hAnsi="Calibri" w:eastAsia="Heiti TC"/>
-                <w:b w:val="0"/>
-                <w:color w:val="111827"/>
-                <w:sz w:val="16"/>
-              </w:rPr>
-              <w:t>风险 2</w:t>
-            </w:r>
-          </w:p>
-        </w:tc>
-      </w:tr>
-      <w:tr>
-        <w:tc>
-          <w:tcPr>
-            <w:tcW w:type="dxa" w:w="3720"/>
-            <w:vAlign w:val="center"/>
-          </w:tcPr>
-          <w:p>
-            <w:pPr>
-              <w:spacing w:before="0" w:after="0"/>
-            </w:pPr>
-            <w:r/>
-            <w:r>
-              <w:rPr>
-                <w:rFonts w:ascii="Calibri" w:hAnsi="Calibri" w:eastAsia="Heiti TC"/>
-                <w:b w:val="0"/>
-                <w:color w:val="111827"/>
-                <w:sz w:val="17"/>
-              </w:rPr>
-              <w:t>Recent analyst reports</w:t>
-            </w:r>
-          </w:p>
-        </w:tc>
-        <w:tc>
-          <w:tcPr>
-            <w:tcW w:type="dxa" w:w="1560"/>
-            <w:vAlign w:val="center"/>
-          </w:tcPr>
-          <w:p>
-            <w:pPr>
-              <w:spacing w:before="0" w:after="0"/>
-            </w:pPr>
-            <w:r/>
-            <w:r>
-              <w:rPr>
-                <w:rFonts w:ascii="Calibri" w:hAnsi="Calibri" w:eastAsia="Heiti TC"/>
-                <w:b w:val="0"/>
-                <w:color w:val="111827"/>
-                <w:sz w:val="16"/>
-              </w:rPr>
-              <w:t>未识别</w:t>
-            </w:r>
-          </w:p>
-        </w:tc>
-        <w:tc>
-          <w:tcPr>
-            <w:tcW w:type="dxa" w:w="1680"/>
-            <w:vAlign w:val="center"/>
-          </w:tcPr>
-          <w:p>
-            <w:pPr>
-              <w:spacing w:before="0" w:after="0"/>
-            </w:pPr>
-            <w:r/>
-            <w:r>
-              <w:rPr>
-                <w:rFonts w:ascii="Calibri" w:hAnsi="Calibri" w:eastAsia="Heiti TC"/>
+                <w:rFonts w:ascii="Calibri" w:hAnsi="Calibri" w:eastAsia="Arial Unicode MS"/>
                 <w:b w:val="0"/>
                 <w:color w:val="111827"/>
                 <w:sz w:val="16"/>
@@ -2144,12 +2689,12 @@
             <w:r/>
             <w:r>
               <w:rPr>
-                <w:rFonts w:ascii="Calibri" w:hAnsi="Calibri" w:eastAsia="Heiti TC"/>
+                <w:rFonts w:ascii="Calibri" w:hAnsi="Calibri" w:eastAsia="Arial Unicode MS"/>
                 <w:b/>
                 <w:color w:val="111827"/>
                 <w:sz w:val="17"/>
               </w:rPr>
-              <w:t>39.9</w:t>
+              <w:t>42.6</w:t>
             </w:r>
           </w:p>
         </w:tc>
@@ -2166,7 +2711,116 @@
             <w:r/>
             <w:r>
               <w:rPr>
-                <w:rFonts w:ascii="Calibri" w:hAnsi="Calibri" w:eastAsia="Heiti TC"/>
+                <w:rFonts w:ascii="Calibri" w:hAnsi="Calibri" w:eastAsia="Arial Unicode MS"/>
+                <w:b w:val="0"/>
+                <w:color w:val="111827"/>
+                <w:sz w:val="16"/>
+              </w:rPr>
+              <w:t>风险 1</w:t>
+            </w:r>
+          </w:p>
+        </w:tc>
+      </w:tr>
+      <w:tr>
+        <w:tc>
+          <w:tcPr>
+            <w:tcW w:type="dxa" w:w="3720"/>
+            <w:vAlign w:val="center"/>
+          </w:tcPr>
+          <w:p>
+            <w:pPr>
+              <w:spacing w:before="0" w:after="0"/>
+            </w:pPr>
+            <w:r/>
+            <w:r>
+              <w:rPr>
+                <w:rFonts w:ascii="Calibri" w:hAnsi="Calibri" w:eastAsia="Arial Unicode MS"/>
+                <w:b w:val="0"/>
+                <w:color w:val="111827"/>
+                <w:sz w:val="17"/>
+              </w:rPr>
+              <w:t>research discussion Session Brief</w:t>
+            </w:r>
+          </w:p>
+        </w:tc>
+        <w:tc>
+          <w:tcPr>
+            <w:tcW w:type="dxa" w:w="1560"/>
+            <w:vAlign w:val="center"/>
+          </w:tcPr>
+          <w:p>
+            <w:pPr>
+              <w:spacing w:before="0" w:after="0"/>
+            </w:pPr>
+            <w:r/>
+            <w:r>
+              <w:rPr>
+                <w:rFonts w:ascii="Calibri" w:hAnsi="Calibri" w:eastAsia="Arial Unicode MS"/>
+                <w:b w:val="0"/>
+                <w:color w:val="111827"/>
+                <w:sz w:val="16"/>
+              </w:rPr>
+              <w:t>未识别</w:t>
+            </w:r>
+          </w:p>
+        </w:tc>
+        <w:tc>
+          <w:tcPr>
+            <w:tcW w:type="dxa" w:w="1680"/>
+            <w:vAlign w:val="center"/>
+          </w:tcPr>
+          <w:p>
+            <w:pPr>
+              <w:spacing w:before="0" w:after="0"/>
+            </w:pPr>
+            <w:r/>
+            <w:r>
+              <w:rPr>
+                <w:rFonts w:ascii="Calibri" w:hAnsi="Calibri" w:eastAsia="Arial Unicode MS"/>
+                <w:b w:val="0"/>
+                <w:color w:val="111827"/>
+                <w:sz w:val="16"/>
+              </w:rPr>
+              <w:t>宏观通胀传导</w:t>
+            </w:r>
+          </w:p>
+        </w:tc>
+        <w:tc>
+          <w:tcPr>
+            <w:tcW w:type="dxa" w:w="900"/>
+            <w:vAlign w:val="center"/>
+          </w:tcPr>
+          <w:p>
+            <w:pPr>
+              <w:spacing w:before="0" w:after="0"/>
+              <w:jc w:val="center"/>
+            </w:pPr>
+            <w:r/>
+            <w:r>
+              <w:rPr>
+                <w:rFonts w:ascii="Calibri" w:hAnsi="Calibri" w:eastAsia="Arial Unicode MS"/>
+                <w:b/>
+                <w:color w:val="111827"/>
+                <w:sz w:val="17"/>
+              </w:rPr>
+              <w:t>42.4</w:t>
+            </w:r>
+          </w:p>
+        </w:tc>
+        <w:tc>
+          <w:tcPr>
+            <w:tcW w:type="dxa" w:w="1500"/>
+            <w:vAlign w:val="center"/>
+          </w:tcPr>
+          <w:p>
+            <w:pPr>
+              <w:spacing w:before="0" w:after="0"/>
+              <w:jc w:val="center"/>
+            </w:pPr>
+            <w:r/>
+            <w:r>
+              <w:rPr>
+                <w:rFonts w:ascii="Calibri" w:hAnsi="Calibri" w:eastAsia="Arial Unicode MS"/>
                 <w:b w:val="0"/>
                 <w:color w:val="111827"/>
                 <w:sz w:val="16"/>
@@ -2189,12 +2843,12 @@
             <w:r/>
             <w:r>
               <w:rPr>
-                <w:rFonts w:ascii="Calibri" w:hAnsi="Calibri" w:eastAsia="Heiti TC"/>
+                <w:rFonts w:ascii="Calibri" w:hAnsi="Calibri" w:eastAsia="Arial Unicode MS"/>
                 <w:b w:val="0"/>
                 <w:color w:val="111827"/>
                 <w:sz w:val="17"/>
               </w:rPr>
-              <w:t>2026-07-30 - HBM 与 AI 电力链配置排序</w:t>
+              <w:t>research discussion Session Brief</w:t>
             </w:r>
           </w:p>
         </w:tc>
@@ -2210,7 +2864,7 @@
             <w:r/>
             <w:r>
               <w:rPr>
-                <w:rFonts w:ascii="Calibri" w:hAnsi="Calibri" w:eastAsia="Heiti TC"/>
+                <w:rFonts w:ascii="Calibri" w:hAnsi="Calibri" w:eastAsia="Arial Unicode MS"/>
                 <w:b w:val="0"/>
                 <w:color w:val="111827"/>
                 <w:sz w:val="16"/>
@@ -2231,12 +2885,12 @@
             <w:r/>
             <w:r>
               <w:rPr>
-                <w:rFonts w:ascii="Calibri" w:hAnsi="Calibri" w:eastAsia="Heiti TC"/>
+                <w:rFonts w:ascii="Calibri" w:hAnsi="Calibri" w:eastAsia="Arial Unicode MS"/>
                 <w:b w:val="0"/>
                 <w:color w:val="111827"/>
                 <w:sz w:val="16"/>
               </w:rPr>
-              <w:t>AI 基础设施</w:t>
+              <w:t>宏观通胀传导</w:t>
             </w:r>
           </w:p>
         </w:tc>
@@ -2253,12 +2907,12 @@
             <w:r/>
             <w:r>
               <w:rPr>
-                <w:rFonts w:ascii="Calibri" w:hAnsi="Calibri" w:eastAsia="Heiti TC"/>
+                <w:rFonts w:ascii="Calibri" w:hAnsi="Calibri" w:eastAsia="Arial Unicode MS"/>
                 <w:b/>
                 <w:color w:val="111827"/>
                 <w:sz w:val="17"/>
               </w:rPr>
-              <w:t>39.8</w:t>
+              <w:t>42.1</w:t>
             </w:r>
           </w:p>
         </w:tc>
@@ -2275,7 +2929,7 @@
             <w:r/>
             <w:r>
               <w:rPr>
-                <w:rFonts w:ascii="Calibri" w:hAnsi="Calibri" w:eastAsia="Heiti TC"/>
+                <w:rFonts w:ascii="Calibri" w:hAnsi="Calibri" w:eastAsia="Arial Unicode MS"/>
                 <w:b w:val="0"/>
                 <w:color w:val="111827"/>
                 <w:sz w:val="16"/>
@@ -2298,12 +2952,12 @@
             <w:r/>
             <w:r>
               <w:rPr>
-                <w:rFonts w:ascii="Calibri" w:hAnsi="Calibri" w:eastAsia="Heiti TC"/>
+                <w:rFonts w:ascii="Calibri" w:hAnsi="Calibri" w:eastAsia="Arial Unicode MS"/>
                 <w:b w:val="0"/>
                 <w:color w:val="111827"/>
                 <w:sz w:val="17"/>
               </w:rPr>
-              <w:t>2026-07-30 电子与 AI 硬件拥挤度的因子化减仓阈值</w:t>
+              <w:t>Recent analyst reports</w:t>
             </w:r>
           </w:p>
         </w:tc>
@@ -2319,7 +2973,7 @@
             <w:r/>
             <w:r>
               <w:rPr>
-                <w:rFonts w:ascii="Calibri" w:hAnsi="Calibri" w:eastAsia="Heiti TC"/>
+                <w:rFonts w:ascii="Calibri" w:hAnsi="Calibri" w:eastAsia="Arial Unicode MS"/>
                 <w:b w:val="0"/>
                 <w:color w:val="111827"/>
                 <w:sz w:val="16"/>
@@ -2340,7 +2994,7 @@
             <w:r/>
             <w:r>
               <w:rPr>
-                <w:rFonts w:ascii="Calibri" w:hAnsi="Calibri" w:eastAsia="Heiti TC"/>
+                <w:rFonts w:ascii="Calibri" w:hAnsi="Calibri" w:eastAsia="Arial Unicode MS"/>
                 <w:b w:val="0"/>
                 <w:color w:val="111827"/>
                 <w:sz w:val="16"/>
@@ -2362,12 +3016,12 @@
             <w:r/>
             <w:r>
               <w:rPr>
-                <w:rFonts w:ascii="Calibri" w:hAnsi="Calibri" w:eastAsia="Heiti TC"/>
+                <w:rFonts w:ascii="Calibri" w:hAnsi="Calibri" w:eastAsia="Arial Unicode MS"/>
                 <w:b/>
                 <w:color w:val="111827"/>
                 <w:sz w:val="17"/>
               </w:rPr>
-              <w:t>39.3</w:t>
+              <w:t>41.9</w:t>
             </w:r>
           </w:p>
         </w:tc>
@@ -2384,7 +3038,7 @@
             <w:r/>
             <w:r>
               <w:rPr>
-                <w:rFonts w:ascii="Calibri" w:hAnsi="Calibri" w:eastAsia="Heiti TC"/>
+                <w:rFonts w:ascii="Calibri" w:hAnsi="Calibri" w:eastAsia="Arial Unicode MS"/>
                 <w:b w:val="0"/>
                 <w:color w:val="111827"/>
                 <w:sz w:val="16"/>
@@ -2407,12 +3061,12 @@
             <w:r/>
             <w:r>
               <w:rPr>
-                <w:rFonts w:ascii="Calibri" w:hAnsi="Calibri" w:eastAsia="Heiti TC"/>
+                <w:rFonts w:ascii="Calibri" w:hAnsi="Calibri" w:eastAsia="Arial Unicode MS"/>
                 <w:b w:val="0"/>
                 <w:color w:val="111827"/>
                 <w:sz w:val="17"/>
               </w:rPr>
-              <w:t>把宏观分化判断转成 3 个月跨资产立场</w:t>
+              <w:t>研究报告：2026-07-30</w:t>
             </w:r>
           </w:p>
         </w:tc>
@@ -2428,7 +3082,7 @@
             <w:r/>
             <w:r>
               <w:rPr>
-                <w:rFonts w:ascii="Calibri" w:hAnsi="Calibri" w:eastAsia="Heiti TC"/>
+                <w:rFonts w:ascii="Calibri" w:hAnsi="Calibri" w:eastAsia="Arial Unicode MS"/>
                 <w:b w:val="0"/>
                 <w:color w:val="111827"/>
                 <w:sz w:val="16"/>
@@ -2449,7 +3103,7 @@
             <w:r/>
             <w:r>
               <w:rPr>
-                <w:rFonts w:ascii="Calibri" w:hAnsi="Calibri" w:eastAsia="Heiti TC"/>
+                <w:rFonts w:ascii="Calibri" w:hAnsi="Calibri" w:eastAsia="Arial Unicode MS"/>
                 <w:b w:val="0"/>
                 <w:color w:val="111827"/>
                 <w:sz w:val="16"/>
@@ -2471,12 +3125,12 @@
             <w:r/>
             <w:r>
               <w:rPr>
-                <w:rFonts w:ascii="Calibri" w:hAnsi="Calibri" w:eastAsia="Heiti TC"/>
+                <w:rFonts w:ascii="Calibri" w:hAnsi="Calibri" w:eastAsia="Arial Unicode MS"/>
                 <w:b/>
                 <w:color w:val="111827"/>
                 <w:sz w:val="17"/>
               </w:rPr>
-              <w:t>39.0</w:t>
+              <w:t>41.4</w:t>
             </w:r>
           </w:p>
         </w:tc>
@@ -2493,225 +3147,7 @@
             <w:r/>
             <w:r>
               <w:rPr>
-                <w:rFonts w:ascii="Calibri" w:hAnsi="Calibri" w:eastAsia="Heiti TC"/>
-                <w:b w:val="0"/>
-                <w:color w:val="111827"/>
-                <w:sz w:val="16"/>
-              </w:rPr>
-              <w:t>常规</w:t>
-            </w:r>
-          </w:p>
-        </w:tc>
-      </w:tr>
-      <w:tr>
-        <w:tc>
-          <w:tcPr>
-            <w:tcW w:type="dxa" w:w="3720"/>
-            <w:vAlign w:val="center"/>
-          </w:tcPr>
-          <w:p>
-            <w:pPr>
-              <w:spacing w:before="0" w:after="0"/>
-            </w:pPr>
-            <w:r/>
-            <w:r>
-              <w:rPr>
-                <w:rFonts w:ascii="Calibri" w:hAnsi="Calibri" w:eastAsia="Heiti TC"/>
-                <w:b w:val="0"/>
-                <w:color w:val="111827"/>
-                <w:sz w:val="17"/>
-              </w:rPr>
-              <w:t>已融资capex向已上电芯片的转化率（2027–2028）</w:t>
-            </w:r>
-          </w:p>
-        </w:tc>
-        <w:tc>
-          <w:tcPr>
-            <w:tcW w:type="dxa" w:w="1560"/>
-            <w:vAlign w:val="center"/>
-          </w:tcPr>
-          <w:p>
-            <w:pPr>
-              <w:spacing w:before="0" w:after="0"/>
-            </w:pPr>
-            <w:r/>
-            <w:r>
-              <w:rPr>
-                <w:rFonts w:ascii="Calibri" w:hAnsi="Calibri" w:eastAsia="Heiti TC"/>
-                <w:b w:val="0"/>
-                <w:color w:val="111827"/>
-                <w:sz w:val="16"/>
-              </w:rPr>
-              <w:t>未识别</w:t>
-            </w:r>
-          </w:p>
-        </w:tc>
-        <w:tc>
-          <w:tcPr>
-            <w:tcW w:type="dxa" w:w="1680"/>
-            <w:vAlign w:val="center"/>
-          </w:tcPr>
-          <w:p>
-            <w:pPr>
-              <w:spacing w:before="0" w:after="0"/>
-            </w:pPr>
-            <w:r/>
-            <w:r>
-              <w:rPr>
-                <w:rFonts w:ascii="Calibri" w:hAnsi="Calibri" w:eastAsia="Heiti TC"/>
-                <w:b w:val="0"/>
-                <w:color w:val="111827"/>
-                <w:sz w:val="16"/>
-              </w:rPr>
-              <w:t>AI 基础设施</w:t>
-            </w:r>
-          </w:p>
-        </w:tc>
-        <w:tc>
-          <w:tcPr>
-            <w:tcW w:type="dxa" w:w="900"/>
-            <w:vAlign w:val="center"/>
-          </w:tcPr>
-          <w:p>
-            <w:pPr>
-              <w:spacing w:before="0" w:after="0"/>
-              <w:jc w:val="center"/>
-            </w:pPr>
-            <w:r/>
-            <w:r>
-              <w:rPr>
-                <w:rFonts w:ascii="Calibri" w:hAnsi="Calibri" w:eastAsia="Heiti TC"/>
-                <w:b/>
-                <w:color w:val="111827"/>
-                <w:sz w:val="17"/>
-              </w:rPr>
-              <w:t>38.9</w:t>
-            </w:r>
-          </w:p>
-        </w:tc>
-        <w:tc>
-          <w:tcPr>
-            <w:tcW w:type="dxa" w:w="1500"/>
-            <w:vAlign w:val="center"/>
-          </w:tcPr>
-          <w:p>
-            <w:pPr>
-              <w:spacing w:before="0" w:after="0"/>
-              <w:jc w:val="center"/>
-            </w:pPr>
-            <w:r/>
-            <w:r>
-              <w:rPr>
-                <w:rFonts w:ascii="Calibri" w:hAnsi="Calibri" w:eastAsia="Heiti TC"/>
-                <w:b w:val="0"/>
-                <w:color w:val="111827"/>
-                <w:sz w:val="16"/>
-              </w:rPr>
-              <w:t>风险 2</w:t>
-            </w:r>
-          </w:p>
-        </w:tc>
-      </w:tr>
-      <w:tr>
-        <w:tc>
-          <w:tcPr>
-            <w:tcW w:type="dxa" w:w="3720"/>
-            <w:vAlign w:val="center"/>
-          </w:tcPr>
-          <w:p>
-            <w:pPr>
-              <w:spacing w:before="0" w:after="0"/>
-            </w:pPr>
-            <w:r/>
-            <w:r>
-              <w:rPr>
-                <w:rFonts w:ascii="Calibri" w:hAnsi="Calibri" w:eastAsia="Heiti TC"/>
-                <w:b w:val="0"/>
-                <w:color w:val="111827"/>
-                <w:sz w:val="17"/>
-              </w:rPr>
-              <w:t>2026-07-30 GDP/PCE 数据后，是否仍支持 3–4 年久期与 3–5% 现金，还是应转向显性利率对冲？</w:t>
-            </w:r>
-          </w:p>
-        </w:tc>
-        <w:tc>
-          <w:tcPr>
-            <w:tcW w:type="dxa" w:w="1560"/>
-            <w:vAlign w:val="center"/>
-          </w:tcPr>
-          <w:p>
-            <w:pPr>
-              <w:spacing w:before="0" w:after="0"/>
-            </w:pPr>
-            <w:r/>
-            <w:r>
-              <w:rPr>
-                <w:rFonts w:ascii="Calibri" w:hAnsi="Calibri" w:eastAsia="Heiti TC"/>
-                <w:b w:val="0"/>
-                <w:color w:val="111827"/>
-                <w:sz w:val="16"/>
-              </w:rPr>
-              <w:t>未识别</w:t>
-            </w:r>
-          </w:p>
-        </w:tc>
-        <w:tc>
-          <w:tcPr>
-            <w:tcW w:type="dxa" w:w="1680"/>
-            <w:vAlign w:val="center"/>
-          </w:tcPr>
-          <w:p>
-            <w:pPr>
-              <w:spacing w:before="0" w:after="0"/>
-            </w:pPr>
-            <w:r/>
-            <w:r>
-              <w:rPr>
-                <w:rFonts w:ascii="Calibri" w:hAnsi="Calibri" w:eastAsia="Heiti TC"/>
-                <w:b w:val="0"/>
-                <w:color w:val="111827"/>
-                <w:sz w:val="16"/>
-              </w:rPr>
-              <w:t>宏观通胀传导</w:t>
-            </w:r>
-          </w:p>
-        </w:tc>
-        <w:tc>
-          <w:tcPr>
-            <w:tcW w:type="dxa" w:w="900"/>
-            <w:vAlign w:val="center"/>
-          </w:tcPr>
-          <w:p>
-            <w:pPr>
-              <w:spacing w:before="0" w:after="0"/>
-              <w:jc w:val="center"/>
-            </w:pPr>
-            <w:r/>
-            <w:r>
-              <w:rPr>
-                <w:rFonts w:ascii="Calibri" w:hAnsi="Calibri" w:eastAsia="Heiti TC"/>
-                <w:b/>
-                <w:color w:val="111827"/>
-                <w:sz w:val="17"/>
-              </w:rPr>
-              <w:t>38.9</w:t>
-            </w:r>
-          </w:p>
-        </w:tc>
-        <w:tc>
-          <w:tcPr>
-            <w:tcW w:type="dxa" w:w="1500"/>
-            <w:vAlign w:val="center"/>
-          </w:tcPr>
-          <w:p>
-            <w:pPr>
-              <w:spacing w:before="0" w:after="0"/>
-              <w:jc w:val="center"/>
-            </w:pPr>
-            <w:r/>
-            <w:r>
-              <w:rPr>
-                <w:rFonts w:ascii="Calibri" w:hAnsi="Calibri" w:eastAsia="Heiti TC"/>
+                <w:rFonts w:ascii="Calibri" w:hAnsi="Calibri" w:eastAsia="Arial Unicode MS"/>
                 <w:b w:val="0"/>
                 <w:color w:val="111827"/>
                 <w:sz w:val="16"/>
@@ -2734,12 +3170,12 @@
             <w:r/>
             <w:r>
               <w:rPr>
-                <w:rFonts w:ascii="Calibri" w:hAnsi="Calibri" w:eastAsia="Heiti TC"/>
+                <w:rFonts w:ascii="Calibri" w:hAnsi="Calibri" w:eastAsia="Arial Unicode MS"/>
                 <w:b w:val="0"/>
                 <w:color w:val="111827"/>
                 <w:sz w:val="17"/>
               </w:rPr>
-              <w:t>2026-07-30 AI出口超配组合中的做多美元尾部对冲</w:t>
+              <w:t>材料行业午间同步简报（2026-07-30）</w:t>
             </w:r>
           </w:p>
         </w:tc>
@@ -2755,7 +3191,7 @@
             <w:r/>
             <w:r>
               <w:rPr>
-                <w:rFonts w:ascii="Calibri" w:hAnsi="Calibri" w:eastAsia="Heiti TC"/>
+                <w:rFonts w:ascii="Calibri" w:hAnsi="Calibri" w:eastAsia="Arial Unicode MS"/>
                 <w:b w:val="0"/>
                 <w:color w:val="111827"/>
                 <w:sz w:val="16"/>
@@ -2776,7 +3212,7 @@
             <w:r/>
             <w:r>
               <w:rPr>
-                <w:rFonts w:ascii="Calibri" w:hAnsi="Calibri" w:eastAsia="Heiti TC"/>
+                <w:rFonts w:ascii="Calibri" w:hAnsi="Calibri" w:eastAsia="Arial Unicode MS"/>
                 <w:b w:val="0"/>
                 <w:color w:val="111827"/>
                 <w:sz w:val="16"/>
@@ -2798,12 +3234,12 @@
             <w:r/>
             <w:r>
               <w:rPr>
-                <w:rFonts w:ascii="Calibri" w:hAnsi="Calibri" w:eastAsia="Heiti TC"/>
+                <w:rFonts w:ascii="Calibri" w:hAnsi="Calibri" w:eastAsia="Arial Unicode MS"/>
                 <w:b/>
                 <w:color w:val="111827"/>
                 <w:sz w:val="17"/>
               </w:rPr>
-              <w:t>38.9</w:t>
+              <w:t>41.0</w:t>
             </w:r>
           </w:p>
         </w:tc>
@@ -2820,116 +3256,7 @@
             <w:r/>
             <w:r>
               <w:rPr>
-                <w:rFonts w:ascii="Calibri" w:hAnsi="Calibri" w:eastAsia="Heiti TC"/>
-                <w:b w:val="0"/>
-                <w:color w:val="111827"/>
-                <w:sz w:val="16"/>
-              </w:rPr>
-              <w:t>常规</w:t>
-            </w:r>
-          </w:p>
-        </w:tc>
-      </w:tr>
-      <w:tr>
-        <w:tc>
-          <w:tcPr>
-            <w:tcW w:type="dxa" w:w="3720"/>
-            <w:vAlign w:val="center"/>
-          </w:tcPr>
-          <w:p>
-            <w:pPr>
-              <w:spacing w:before="0" w:after="0"/>
-            </w:pPr>
-            <w:r/>
-            <w:r>
-              <w:rPr>
-                <w:rFonts w:ascii="Calibri" w:hAnsi="Calibri" w:eastAsia="Heiti TC"/>
-                <w:b w:val="0"/>
-                <w:color w:val="111827"/>
-                <w:sz w:val="17"/>
-              </w:rPr>
-              <w:t>央行终于动了，汇率却拒绝跟随</w:t>
-            </w:r>
-          </w:p>
-        </w:tc>
-        <w:tc>
-          <w:tcPr>
-            <w:tcW w:type="dxa" w:w="1560"/>
-            <w:vAlign w:val="center"/>
-          </w:tcPr>
-          <w:p>
-            <w:pPr>
-              <w:spacing w:before="0" w:after="0"/>
-            </w:pPr>
-            <w:r/>
-            <w:r>
-              <w:rPr>
-                <w:rFonts w:ascii="Calibri" w:hAnsi="Calibri" w:eastAsia="Heiti TC"/>
-                <w:b w:val="0"/>
-                <w:color w:val="111827"/>
-                <w:sz w:val="16"/>
-              </w:rPr>
-              <w:t>未识别</w:t>
-            </w:r>
-          </w:p>
-        </w:tc>
-        <w:tc>
-          <w:tcPr>
-            <w:tcW w:type="dxa" w:w="1680"/>
-            <w:vAlign w:val="center"/>
-          </w:tcPr>
-          <w:p>
-            <w:pPr>
-              <w:spacing w:before="0" w:after="0"/>
-            </w:pPr>
-            <w:r/>
-            <w:r>
-              <w:rPr>
-                <w:rFonts w:ascii="Calibri" w:hAnsi="Calibri" w:eastAsia="Heiti TC"/>
-                <w:b w:val="0"/>
-                <w:color w:val="111827"/>
-                <w:sz w:val="16"/>
-              </w:rPr>
-              <w:t>宏观通胀传导</w:t>
-            </w:r>
-          </w:p>
-        </w:tc>
-        <w:tc>
-          <w:tcPr>
-            <w:tcW w:type="dxa" w:w="900"/>
-            <w:vAlign w:val="center"/>
-          </w:tcPr>
-          <w:p>
-            <w:pPr>
-              <w:spacing w:before="0" w:after="0"/>
-              <w:jc w:val="center"/>
-            </w:pPr>
-            <w:r/>
-            <w:r>
-              <w:rPr>
-                <w:rFonts w:ascii="Calibri" w:hAnsi="Calibri" w:eastAsia="Heiti TC"/>
-                <w:b/>
-                <w:color w:val="111827"/>
-                <w:sz w:val="17"/>
-              </w:rPr>
-              <w:t>38.6</w:t>
-            </w:r>
-          </w:p>
-        </w:tc>
-        <w:tc>
-          <w:tcPr>
-            <w:tcW w:type="dxa" w:w="1500"/>
-            <w:vAlign w:val="center"/>
-          </w:tcPr>
-          <w:p>
-            <w:pPr>
-              <w:spacing w:before="0" w:after="0"/>
-              <w:jc w:val="center"/>
-            </w:pPr>
-            <w:r/>
-            <w:r>
-              <w:rPr>
-                <w:rFonts w:ascii="Calibri" w:hAnsi="Calibri" w:eastAsia="Heiti TC"/>
+                <w:rFonts w:ascii="Calibri" w:hAnsi="Calibri" w:eastAsia="Arial Unicode MS"/>
                 <w:b w:val="0"/>
                 <w:color w:val="111827"/>
                 <w:sz w:val="16"/>
@@ -2952,12 +3279,12 @@
             <w:r/>
             <w:r>
               <w:rPr>
-                <w:rFonts w:ascii="Calibri" w:hAnsi="Calibri" w:eastAsia="Heiti TC"/>
+                <w:rFonts w:ascii="Calibri" w:hAnsi="Calibri" w:eastAsia="Arial Unicode MS"/>
                 <w:b w:val="0"/>
                 <w:color w:val="111827"/>
                 <w:sz w:val="17"/>
               </w:rPr>
-              <w:t>2026-07-30 久期降至0-5%后的再平衡</w:t>
+              <w:t>风控裁定后的最终全天候配置 — 2026-07-30</w:t>
             </w:r>
           </w:p>
         </w:tc>
@@ -2973,7 +3300,7 @@
             <w:r/>
             <w:r>
               <w:rPr>
-                <w:rFonts w:ascii="Calibri" w:hAnsi="Calibri" w:eastAsia="Heiti TC"/>
+                <w:rFonts w:ascii="Calibri" w:hAnsi="Calibri" w:eastAsia="Arial Unicode MS"/>
                 <w:b w:val="0"/>
                 <w:color w:val="111827"/>
                 <w:sz w:val="16"/>
@@ -2994,7 +3321,7 @@
             <w:r/>
             <w:r>
               <w:rPr>
-                <w:rFonts w:ascii="Calibri" w:hAnsi="Calibri" w:eastAsia="Heiti TC"/>
+                <w:rFonts w:ascii="Calibri" w:hAnsi="Calibri" w:eastAsia="Arial Unicode MS"/>
                 <w:b w:val="0"/>
                 <w:color w:val="111827"/>
                 <w:sz w:val="16"/>
@@ -3016,12 +3343,12 @@
             <w:r/>
             <w:r>
               <w:rPr>
-                <w:rFonts w:ascii="Calibri" w:hAnsi="Calibri" w:eastAsia="Heiti TC"/>
+                <w:rFonts w:ascii="Calibri" w:hAnsi="Calibri" w:eastAsia="Arial Unicode MS"/>
                 <w:b/>
                 <w:color w:val="111827"/>
                 <w:sz w:val="17"/>
               </w:rPr>
-              <w:t>38.5</w:t>
+              <w:t>40.7</w:t>
             </w:r>
           </w:p>
         </w:tc>
@@ -3038,339 +3365,12 @@
             <w:r/>
             <w:r>
               <w:rPr>
-                <w:rFonts w:ascii="Calibri" w:hAnsi="Calibri" w:eastAsia="Heiti TC"/>
-                <w:b w:val="0"/>
-                <w:color w:val="111827"/>
-                <w:sz w:val="16"/>
-              </w:rPr>
-              <w:t>风险 1</w:t>
-            </w:r>
-          </w:p>
-        </w:tc>
-      </w:tr>
-      <w:tr>
-        <w:tc>
-          <w:tcPr>
-            <w:tcW w:type="dxa" w:w="3720"/>
-            <w:vAlign w:val="center"/>
-          </w:tcPr>
-          <w:p>
-            <w:pPr>
-              <w:spacing w:before="0" w:after="0"/>
-            </w:pPr>
-            <w:r/>
-            <w:r>
-              <w:rPr>
-                <w:rFonts w:ascii="Calibri" w:hAnsi="Calibri" w:eastAsia="Heiti TC"/>
-                <w:b w:val="0"/>
-                <w:color w:val="111827"/>
-                <w:sz w:val="17"/>
-              </w:rPr>
-              <w:t>隔夜情绪与资金流扫描</w:t>
-            </w:r>
-          </w:p>
-        </w:tc>
-        <w:tc>
-          <w:tcPr>
-            <w:tcW w:type="dxa" w:w="1560"/>
-            <w:vAlign w:val="center"/>
-          </w:tcPr>
-          <w:p>
-            <w:pPr>
-              <w:spacing w:before="0" w:after="0"/>
-            </w:pPr>
-            <w:r/>
-            <w:r>
-              <w:rPr>
-                <w:rFonts w:ascii="Calibri" w:hAnsi="Calibri" w:eastAsia="Heiti TC"/>
-                <w:b w:val="0"/>
-                <w:color w:val="111827"/>
-                <w:sz w:val="16"/>
-              </w:rPr>
-              <w:t>未识别</w:t>
-            </w:r>
-          </w:p>
-        </w:tc>
-        <w:tc>
-          <w:tcPr>
-            <w:tcW w:type="dxa" w:w="1680"/>
-            <w:vAlign w:val="center"/>
-          </w:tcPr>
-          <w:p>
-            <w:pPr>
-              <w:spacing w:before="0" w:after="0"/>
-            </w:pPr>
-            <w:r/>
-            <w:r>
-              <w:rPr>
-                <w:rFonts w:ascii="Calibri" w:hAnsi="Calibri" w:eastAsia="Heiti TC"/>
-                <w:b w:val="0"/>
-                <w:color w:val="111827"/>
-                <w:sz w:val="16"/>
-              </w:rPr>
-              <w:t>AI 基础设施</w:t>
-            </w:r>
-          </w:p>
-        </w:tc>
-        <w:tc>
-          <w:tcPr>
-            <w:tcW w:type="dxa" w:w="900"/>
-            <w:vAlign w:val="center"/>
-          </w:tcPr>
-          <w:p>
-            <w:pPr>
-              <w:spacing w:before="0" w:after="0"/>
-              <w:jc w:val="center"/>
-            </w:pPr>
-            <w:r/>
-            <w:r>
-              <w:rPr>
-                <w:rFonts w:ascii="Calibri" w:hAnsi="Calibri" w:eastAsia="Heiti TC"/>
-                <w:b/>
-                <w:color w:val="111827"/>
-                <w:sz w:val="17"/>
-              </w:rPr>
-              <w:t>38.4</w:t>
-            </w:r>
-          </w:p>
-        </w:tc>
-        <w:tc>
-          <w:tcPr>
-            <w:tcW w:type="dxa" w:w="1500"/>
-            <w:vAlign w:val="center"/>
-          </w:tcPr>
-          <w:p>
-            <w:pPr>
-              <w:spacing w:before="0" w:after="0"/>
-              <w:jc w:val="center"/>
-            </w:pPr>
-            <w:r/>
-            <w:r>
-              <w:rPr>
-                <w:rFonts w:ascii="Calibri" w:hAnsi="Calibri" w:eastAsia="Heiti TC"/>
-                <w:b w:val="0"/>
-                <w:color w:val="111827"/>
-                <w:sz w:val="16"/>
-              </w:rPr>
-              <w:t>风险 1</w:t>
-            </w:r>
-          </w:p>
-        </w:tc>
-      </w:tr>
-      <w:tr>
-        <w:tc>
-          <w:tcPr>
-            <w:tcW w:type="dxa" w:w="3720"/>
-            <w:vAlign w:val="center"/>
-          </w:tcPr>
-          <w:p>
-            <w:pPr>
-              <w:spacing w:before="0" w:after="0"/>
-            </w:pPr>
-            <w:r/>
-            <w:r>
-              <w:rPr>
-                <w:rFonts w:ascii="Calibri" w:hAnsi="Calibri" w:eastAsia="Heiti TC"/>
-                <w:b w:val="0"/>
-                <w:color w:val="111827"/>
-                <w:sz w:val="17"/>
-              </w:rPr>
-              <w:t>2026-07-30 研究记录08：猪肉基数抬升下的2026-2027年CPI中枢与人民银行路径</w:t>
-            </w:r>
-          </w:p>
-        </w:tc>
-        <w:tc>
-          <w:tcPr>
-            <w:tcW w:type="dxa" w:w="1560"/>
-            <w:vAlign w:val="center"/>
-          </w:tcPr>
-          <w:p>
-            <w:pPr>
-              <w:spacing w:before="0" w:after="0"/>
-            </w:pPr>
-            <w:r/>
-            <w:r>
-              <w:rPr>
-                <w:rFonts w:ascii="Calibri" w:hAnsi="Calibri" w:eastAsia="Heiti TC"/>
-                <w:b w:val="0"/>
-                <w:color w:val="111827"/>
-                <w:sz w:val="16"/>
-              </w:rPr>
-              <w:t>未识别</w:t>
-            </w:r>
-          </w:p>
-        </w:tc>
-        <w:tc>
-          <w:tcPr>
-            <w:tcW w:type="dxa" w:w="1680"/>
-            <w:vAlign w:val="center"/>
-          </w:tcPr>
-          <w:p>
-            <w:pPr>
-              <w:spacing w:before="0" w:after="0"/>
-            </w:pPr>
-            <w:r/>
-            <w:r>
-              <w:rPr>
-                <w:rFonts w:ascii="Calibri" w:hAnsi="Calibri" w:eastAsia="Heiti TC"/>
-                <w:b w:val="0"/>
-                <w:color w:val="111827"/>
-                <w:sz w:val="16"/>
-              </w:rPr>
-              <w:t>宏观通胀传导</w:t>
-            </w:r>
-          </w:p>
-        </w:tc>
-        <w:tc>
-          <w:tcPr>
-            <w:tcW w:type="dxa" w:w="900"/>
-            <w:vAlign w:val="center"/>
-          </w:tcPr>
-          <w:p>
-            <w:pPr>
-              <w:spacing w:before="0" w:after="0"/>
-              <w:jc w:val="center"/>
-            </w:pPr>
-            <w:r/>
-            <w:r>
-              <w:rPr>
-                <w:rFonts w:ascii="Calibri" w:hAnsi="Calibri" w:eastAsia="Heiti TC"/>
-                <w:b/>
-                <w:color w:val="111827"/>
-                <w:sz w:val="17"/>
-              </w:rPr>
-              <w:t>38.3</w:t>
-            </w:r>
-          </w:p>
-        </w:tc>
-        <w:tc>
-          <w:tcPr>
-            <w:tcW w:type="dxa" w:w="1500"/>
-            <w:vAlign w:val="center"/>
-          </w:tcPr>
-          <w:p>
-            <w:pPr>
-              <w:spacing w:before="0" w:after="0"/>
-              <w:jc w:val="center"/>
-            </w:pPr>
-            <w:r/>
-            <w:r>
-              <w:rPr>
-                <w:rFonts w:ascii="Calibri" w:hAnsi="Calibri" w:eastAsia="Heiti TC"/>
+                <w:rFonts w:ascii="Calibri" w:hAnsi="Calibri" w:eastAsia="Arial Unicode MS"/>
                 <w:b w:val="0"/>
                 <w:color w:val="111827"/>
                 <w:sz w:val="16"/>
               </w:rPr>
               <w:t>常规</w:t>
-            </w:r>
-          </w:p>
-        </w:tc>
-      </w:tr>
-      <w:tr>
-        <w:tc>
-          <w:tcPr>
-            <w:tcW w:type="dxa" w:w="3720"/>
-            <w:vAlign w:val="center"/>
-          </w:tcPr>
-          <w:p>
-            <w:pPr>
-              <w:spacing w:before="0" w:after="0"/>
-            </w:pPr>
-            <w:r/>
-            <w:r>
-              <w:rPr>
-                <w:rFonts w:ascii="Calibri" w:hAnsi="Calibri" w:eastAsia="Heiti TC"/>
-                <w:b w:val="0"/>
-                <w:color w:val="111827"/>
-                <w:sz w:val="17"/>
-              </w:rPr>
-              <w:t>2026-07-30 FX 对冲的组合风险预算：保留 delta-one，不把 carry 花掉</w:t>
-            </w:r>
-          </w:p>
-        </w:tc>
-        <w:tc>
-          <w:tcPr>
-            <w:tcW w:type="dxa" w:w="1560"/>
-            <w:vAlign w:val="center"/>
-          </w:tcPr>
-          <w:p>
-            <w:pPr>
-              <w:spacing w:before="0" w:after="0"/>
-            </w:pPr>
-            <w:r/>
-            <w:r>
-              <w:rPr>
-                <w:rFonts w:ascii="Calibri" w:hAnsi="Calibri" w:eastAsia="Heiti TC"/>
-                <w:b w:val="0"/>
-                <w:color w:val="111827"/>
-                <w:sz w:val="16"/>
-              </w:rPr>
-              <w:t>未识别</w:t>
-            </w:r>
-          </w:p>
-        </w:tc>
-        <w:tc>
-          <w:tcPr>
-            <w:tcW w:type="dxa" w:w="1680"/>
-            <w:vAlign w:val="center"/>
-          </w:tcPr>
-          <w:p>
-            <w:pPr>
-              <w:spacing w:before="0" w:after="0"/>
-            </w:pPr>
-            <w:r/>
-            <w:r>
-              <w:rPr>
-                <w:rFonts w:ascii="Calibri" w:hAnsi="Calibri" w:eastAsia="Heiti TC"/>
-                <w:b w:val="0"/>
-                <w:color w:val="111827"/>
-                <w:sz w:val="16"/>
-              </w:rPr>
-              <w:t>宏观通胀传导</w:t>
-            </w:r>
-          </w:p>
-        </w:tc>
-        <w:tc>
-          <w:tcPr>
-            <w:tcW w:type="dxa" w:w="900"/>
-            <w:vAlign w:val="center"/>
-          </w:tcPr>
-          <w:p>
-            <w:pPr>
-              <w:spacing w:before="0" w:after="0"/>
-              <w:jc w:val="center"/>
-            </w:pPr>
-            <w:r/>
-            <w:r>
-              <w:rPr>
-                <w:rFonts w:ascii="Calibri" w:hAnsi="Calibri" w:eastAsia="Heiti TC"/>
-                <w:b/>
-                <w:color w:val="111827"/>
-                <w:sz w:val="17"/>
-              </w:rPr>
-              <w:t>37.9</w:t>
-            </w:r>
-          </w:p>
-        </w:tc>
-        <w:tc>
-          <w:tcPr>
-            <w:tcW w:type="dxa" w:w="1500"/>
-            <w:vAlign w:val="center"/>
-          </w:tcPr>
-          <w:p>
-            <w:pPr>
-              <w:spacing w:before="0" w:after="0"/>
-              <w:jc w:val="center"/>
-            </w:pPr>
-            <w:r/>
-            <w:r>
-              <w:rPr>
-                <w:rFonts w:ascii="Calibri" w:hAnsi="Calibri" w:eastAsia="Heiti TC"/>
-                <w:b w:val="0"/>
-                <w:color w:val="111827"/>
-                <w:sz w:val="16"/>
-              </w:rPr>
-              <w:t>风险 1</w:t>
             </w:r>
           </w:p>
         </w:tc>
@@ -3382,7 +3382,7 @@
       </w:pPr>
       <w:r>
         <w:rPr>
-          <w:rFonts w:ascii="Calibri" w:hAnsi="Calibri" w:eastAsia="Heiti TC"/>
+          <w:rFonts w:ascii="Calibri" w:hAnsi="Calibri" w:eastAsia="Arial Unicode MS"/>
           <w:b w:val="0"/>
           <w:i/>
           <w:color w:val="667085"/>
@@ -3412,7 +3412,7 @@
     </w:pPr>
     <w:r>
       <w:rPr>
-        <w:rFonts w:ascii="Calibri" w:hAnsi="Calibri" w:eastAsia="Heiti TC"/>
+        <w:rFonts w:ascii="Calibri" w:hAnsi="Calibri" w:eastAsia="Arial Unicode MS"/>
         <w:color w:val="667085"/>
         <w:sz w:val="17"/>
       </w:rPr>
@@ -3431,7 +3431,7 @@
     <w:r/>
     <w:r>
       <w:rPr>
-        <w:rFonts w:ascii="Calibri" w:hAnsi="Calibri" w:eastAsia="Heiti TC"/>
+        <w:rFonts w:ascii="Calibri" w:hAnsi="Calibri" w:eastAsia="Arial Unicode MS"/>
         <w:color w:val="667085"/>
         <w:sz w:val="18"/>
       </w:rPr>
@@ -3808,7 +3808,7 @@
       <w:spacing w:after="120" w:line="264" w:lineRule="auto"/>
     </w:pPr>
     <w:rPr>
-      <w:rFonts w:ascii="Calibri" w:hAnsi="Calibri" w:eastAsia="Heiti TC"/>
+      <w:rFonts w:ascii="Calibri" w:hAnsi="Calibri" w:eastAsia="Arial Unicode MS"/>
       <w:b w:val="0"/>
       <w:color w:val="111827"/>
       <w:sz w:val="22"/>
@@ -3873,7 +3873,7 @@
       <w:outlineLvl w:val="0"/>
     </w:pPr>
     <w:rPr>
-      <w:rFonts w:asciiTheme="majorHAnsi" w:eastAsiaTheme="majorEastAsia" w:hAnsiTheme="majorHAnsi" w:cstheme="majorBidi" w:ascii="Calibri" w:hAnsi="Calibri" w:eastAsia="Heiti TC"/>
+      <w:rFonts w:asciiTheme="majorHAnsi" w:eastAsiaTheme="majorEastAsia" w:hAnsiTheme="majorHAnsi" w:cstheme="majorBidi" w:ascii="Calibri" w:hAnsi="Calibri" w:eastAsia="Arial Unicode MS"/>
       <w:b/>
       <w:bCs/>
       <w:color w:val="2E74B5"/>
@@ -3897,7 +3897,7 @@
       <w:outlineLvl w:val="1"/>
     </w:pPr>
     <w:rPr>
-      <w:rFonts w:asciiTheme="majorHAnsi" w:eastAsiaTheme="majorEastAsia" w:hAnsiTheme="majorHAnsi" w:cstheme="majorBidi" w:ascii="Calibri" w:hAnsi="Calibri" w:eastAsia="Heiti TC"/>
+      <w:rFonts w:asciiTheme="majorHAnsi" w:eastAsiaTheme="majorEastAsia" w:hAnsiTheme="majorHAnsi" w:cstheme="majorBidi" w:ascii="Calibri" w:hAnsi="Calibri" w:eastAsia="Arial Unicode MS"/>
       <w:b/>
       <w:bCs/>
       <w:color w:val="2E74B5"/>
@@ -3921,7 +3921,7 @@
       <w:outlineLvl w:val="2"/>
     </w:pPr>
     <w:rPr>
-      <w:rFonts w:asciiTheme="majorHAnsi" w:eastAsiaTheme="majorEastAsia" w:hAnsiTheme="majorHAnsi" w:cstheme="majorBidi" w:ascii="Calibri" w:hAnsi="Calibri" w:eastAsia="Heiti TC"/>
+      <w:rFonts w:asciiTheme="majorHAnsi" w:eastAsiaTheme="majorEastAsia" w:hAnsiTheme="majorHAnsi" w:cstheme="majorBidi" w:ascii="Calibri" w:hAnsi="Calibri" w:eastAsia="Arial Unicode MS"/>
       <w:b/>
       <w:bCs/>
       <w:color w:val="1F4D78"/>
@@ -4163,7 +4163,7 @@
       <w:contextualSpacing/>
     </w:pPr>
     <w:rPr>
-      <w:rFonts w:asciiTheme="majorHAnsi" w:eastAsiaTheme="majorEastAsia" w:hAnsiTheme="majorHAnsi" w:cstheme="majorBidi" w:ascii="Calibri" w:hAnsi="Calibri" w:eastAsia="Heiti TC"/>
+      <w:rFonts w:asciiTheme="majorHAnsi" w:eastAsiaTheme="majorEastAsia" w:hAnsiTheme="majorHAnsi" w:cstheme="majorBidi" w:ascii="Calibri" w:hAnsi="Calibri" w:eastAsia="Arial Unicode MS"/>
       <w:b/>
       <w:color w:val="0B2545"/>
       <w:spacing w:val="5"/>
@@ -4201,7 +4201,7 @@
       </w:numPr>
     </w:pPr>
     <w:rPr>
-      <w:rFonts w:asciiTheme="majorHAnsi" w:eastAsiaTheme="majorEastAsia" w:hAnsiTheme="majorHAnsi" w:cstheme="majorBidi" w:ascii="Calibri" w:hAnsi="Calibri" w:eastAsia="Heiti TC"/>
+      <w:rFonts w:asciiTheme="majorHAnsi" w:eastAsiaTheme="majorEastAsia" w:hAnsiTheme="majorHAnsi" w:cstheme="majorBidi" w:ascii="Calibri" w:hAnsi="Calibri" w:eastAsia="Arial Unicode MS"/>
       <w:b w:val="0"/>
       <w:i/>
       <w:iCs/>

</xml_diff>